<commit_message>
docs: align syllabus with from-scratch pedagogy
</commit_message>
<xml_diff>
--- a/syllabus/INFO 7375 Prompt Engineering for Generative AI.docx
+++ b/syllabus/INFO 7375 Prompt Engineering for Generative AI.docx
@@ -844,7 +844,7 @@
           <w:vertAlign w:val="baseline"/>
           <w:rtl w:val="0"/>
         </w:rPr>
-        <w:t xml:space="preserve">Course Prerequisites</w:t>
+        <w:t>Course Prerequisites</w:t>
       </w:r>
     </w:p>
     <w:p>
@@ -899,12 +899,7 @@
           <w:szCs w:val="22"/>
           <w:rtl w:val="0"/>
         </w:rPr>
-        <w:t xml:space="preserve">A strong programming background is required.  A commitment to do independent research.</w:t>
-      </w:r>
-      <w:r>
-        <w:rPr>
-          <w:rtl w:val="0"/>
-        </w:rPr>
+        <w:t>A strong programming background, Python 3.11 or newer, an active Northeastern Claude Code account, and a commitment to independent research are required. Begin at https://claude.northeastern.edu/. Public readers need their own Claude Code-enabled account.</w:t>
       </w:r>
     </w:p>
     <w:p>
@@ -936,8 +931,6 @@
           <w:szCs w:val="34"/>
         </w:rPr>
       </w:pPr>
-      <w:bookmarkStart w:colFirst="0" w:colLast="0" w:name="_ofqvea6utwhq" w:id="0"/>
-      <w:bookmarkEnd w:id="0"/>
       <w:r>
         <w:rPr>
           <w:rFonts w:ascii="Calibri" w:cs="Calibri" w:eastAsia="Calibri" w:hAnsi="Calibri"/>
@@ -945,7 +938,7 @@
           <w:szCs w:val="34"/>
           <w:rtl w:val="0"/>
         </w:rPr>
-        <w:t xml:space="preserve">Course Description</w:t>
+        <w:t>Course Description</w:t>
       </w:r>
     </w:p>
     <w:p>
@@ -964,7 +957,7 @@
           <w:szCs w:val="22"/>
           <w:rtl w:val="0"/>
         </w:rPr>
-        <w:t xml:space="preserve">Welcome to the world of Prompt Engineering and Fine-Tuning for Generative AI with Large Language Models (LLMs), where we delve deep into the art and science of crafting prompts that drive LLMs to create captivating and context-aware content. In this comprehensive course, you'll not only master the essential techniques for effective prompt engineering but also gain expertise in the fine-tuning and configuration of LLMs. This dual skill set will empower you to harness the full potential of AI-driven creativity and problem-solving across a wide range of domains.</w:t>
+        <w:t>INFO 7375 teaches students to construct, evaluate, and supervise generative AI workflows by implementing their underlying mechanisms in Python and applying them through Claude. The course treats prompting as an experiment, agents as bounded programs, tool use as a permissioned interface, and verification as a separate responsibility from generation.</w:t>
       </w:r>
     </w:p>
     <w:p>
@@ -987,7 +980,7 @@
           <w:szCs w:val="22"/>
           <w:rtl w:val="0"/>
         </w:rPr>
-        <w:t xml:space="preserve">Course Highlights:</w:t>
+        <w:t>From-scratch emphasis</w:t>
       </w:r>
     </w:p>
     <w:p>
@@ -1013,16 +1006,7 @@
           <w:szCs w:val="22"/>
           <w:rtl w:val="0"/>
         </w:rPr>
-        <w:t xml:space="preserve">Prompt Engineering Mastery:</w:t>
-      </w:r>
-      <w:r>
-        <w:rPr>
-          <w:rFonts w:ascii="Calibri" w:cs="Calibri" w:eastAsia="Calibri" w:hAnsi="Calibri"/>
-          <w:sz w:val="22"/>
-          <w:szCs w:val="22"/>
-          <w:rtl w:val="0"/>
-        </w:rPr>
-        <w:t xml:space="preserve"> Learn the principles of creating prompts that elicit desired responses from LLMs, whether you're generating text, code, or creative content.</w:t>
+        <w:t>Students first build inspectable mechanisms: probability normalization, prompt contracts, retrieval scores, bounded agent loops, path and permission checks, a small Model Context Protocol server, a gradient update, tool dispatch, versioned memory, evaluation procedures, and proposal-bound approval gates.</w:t>
       </w:r>
     </w:p>
     <w:p>
@@ -1048,16 +1032,7 @@
           <w:szCs w:val="22"/>
           <w:rtl w:val="0"/>
         </w:rPr>
-        <w:t xml:space="preserve">Fine-Tuning Expertise:</w:t>
-      </w:r>
-      <w:r>
-        <w:rPr>
-          <w:rFonts w:ascii="Calibri" w:cs="Calibri" w:eastAsia="Calibri" w:hAnsi="Calibri"/>
-          <w:sz w:val="22"/>
-          <w:szCs w:val="22"/>
-          <w:rtl w:val="0"/>
-        </w:rPr>
-        <w:t xml:space="preserve"> Explore the intricate process of fine-tuning LLMs, optimizing them for specific tasks, domains, and applications.</w:t>
+        <w:t>Claude and Python only</w:t>
       </w:r>
     </w:p>
     <w:p>
@@ -1083,16 +1058,7 @@
           <w:szCs w:val="22"/>
           <w:rtl w:val="0"/>
         </w:rPr>
-        <w:t xml:space="preserve">Real-World Applications:</w:t>
-      </w:r>
-      <w:r>
-        <w:rPr>
-          <w:rFonts w:ascii="Calibri" w:cs="Calibri" w:eastAsia="Calibri" w:hAnsi="Calibri"/>
-          <w:sz w:val="22"/>
-          <w:szCs w:val="22"/>
-          <w:rtl w:val="0"/>
-        </w:rPr>
-        <w:t xml:space="preserve"> Apply your skills to real-world scenarios, from content creation and decision support to interactive media and beyond.</w:t>
+        <w:t>Claude chat, Claude Code, Claude Cowork, and the Claude Messages API are the course's model interfaces. All executable course implementations are Python. Markdown and JSON are artifact formats; YAML configures continuous integration. No orchestration framework or frontend stack is required for the lessons.</w:t>
       </w:r>
     </w:p>
     <w:p>
@@ -1118,16 +1084,7 @@
           <w:szCs w:val="22"/>
           <w:rtl w:val="0"/>
         </w:rPr>
-        <w:t xml:space="preserve">Ethical Considerations:</w:t>
-      </w:r>
-      <w:r>
-        <w:rPr>
-          <w:rFonts w:ascii="Calibri" w:cs="Calibri" w:eastAsia="Calibri" w:hAnsi="Calibri"/>
-          <w:sz w:val="22"/>
-          <w:szCs w:val="22"/>
-          <w:rtl w:val="0"/>
-        </w:rPr>
-        <w:t xml:space="preserve"> Discuss the ethical implications of AI-generated content and responsible AI usage in media production.</w:t>
+        <w:t>Offline first and explicit model calls</w:t>
       </w:r>
     </w:p>
     <w:p>
@@ -1153,16 +1110,7 @@
           <w:szCs w:val="22"/>
           <w:rtl w:val="0"/>
         </w:rPr>
-        <w:t xml:space="preserve">Hands-On Experience:</w:t>
-      </w:r>
-      <w:r>
-        <w:rPr>
-          <w:rFonts w:ascii="Calibri" w:cs="Calibri" w:eastAsia="Calibri" w:hAnsi="Calibri"/>
-          <w:sz w:val="22"/>
-          <w:szCs w:val="22"/>
-          <w:rtl w:val="0"/>
-        </w:rPr>
-        <w:t xml:space="preserve"> Engage in practical exercises, assignments, and projects to reinforce your learning and gain practical experience in prompt engineering and LLM fine-tuning.</w:t>
+        <w:t>Reference programs and tests run offline before students use Claude. Direct API calls are clearly labeled optional extensions and may require separately provisioned credits. Northeastern Claude Code access is not treated as an API-key entitlement.</w:t>
       </w:r>
     </w:p>
     <w:p>
@@ -1181,7 +1129,7 @@
           <w:szCs w:val="22"/>
           <w:rtl w:val="0"/>
         </w:rPr>
-        <w:t xml:space="preserve">By the end of this course, you will not only be proficient in the art of prompt engineering for generative AI but also equipped with the skills to configure and fine-tune LLMs, enabling you to unleash the power of AI-driven creativity and problem-solving across diverse domains. Join us on this transformative journey into the realm of AI-driven creativity and problem-solving.</w:t>
+        <w:t>By the end of the course, students will be able to explain the mechanisms they built, distinguish evidence from plausible narration, and defend the human decisions governing an AI-assisted workflow.</w:t>
       </w:r>
     </w:p>
     <w:p>
@@ -1214,8 +1162,6 @@
           <w:szCs w:val="34"/>
         </w:rPr>
       </w:pPr>
-      <w:bookmarkStart w:colFirst="0" w:colLast="0" w:name="_jigrb4xbci7y" w:id="1"/>
-      <w:bookmarkEnd w:id="1"/>
       <w:r>
         <w:rPr>
           <w:rFonts w:ascii="Calibri" w:cs="Calibri" w:eastAsia="Calibri" w:hAnsi="Calibri"/>
@@ -1223,7 +1169,7 @@
           <w:szCs w:val="34"/>
           <w:rtl w:val="0"/>
         </w:rPr>
-        <w:t xml:space="preserve">Learning Objectives</w:t>
+        <w:t>Learning Objectives</w:t>
       </w:r>
     </w:p>
     <w:p>
@@ -1237,8 +1183,6 @@
           <w:szCs w:val="26"/>
         </w:rPr>
       </w:pPr>
-      <w:bookmarkStart w:colFirst="0" w:colLast="0" w:name="_ungrvm9wgkdo" w:id="2"/>
-      <w:bookmarkEnd w:id="2"/>
       <w:r>
         <w:rPr>
           <w:rFonts w:ascii="Calibri" w:cs="Calibri" w:eastAsia="Calibri" w:hAnsi="Calibri"/>
@@ -1246,7 +1190,7 @@
           <w:szCs w:val="26"/>
           <w:rtl w:val="0"/>
         </w:rPr>
-        <w:t xml:space="preserve">Module 1: Introduction to LLMs and Prompting</w:t>
+        <w:t>Students who complete the course will be able to</w:t>
       </w:r>
     </w:p>
     <w:p>
@@ -1270,7 +1214,7 @@
           <w:szCs w:val="22"/>
           <w:rtl w:val="0"/>
         </w:rPr>
-        <w:t xml:space="preserve">Unveiling Large Language Models (LLMs): Their capabilities, use cases, and historical context.</w:t>
+        <w:t>Explain probabilistic generation and evaluate prompt changes with controlled experiments.</w:t>
       </w:r>
     </w:p>
     <w:p>
@@ -1294,7 +1238,7 @@
           <w:szCs w:val="22"/>
           <w:rtl w:val="0"/>
         </w:rPr>
-        <w:t xml:space="preserve">Understanding randomness in LLM output and setting the stage for effective prompt engineering.</w:t>
+        <w:t>Build prompt contracts, lexical retrieval, and evidence checks in Python.</w:t>
       </w:r>
     </w:p>
     <w:p>
@@ -1318,30 +1262,31 @@
           <w:szCs w:val="22"/>
           <w:rtl w:val="0"/>
         </w:rPr>
-        <w:t xml:space="preserve">Creating Your First Prompts: A hands-on initiation into the world of AI-powered content generation.</w:t>
-      </w:r>
-    </w:p>
-    <w:p>
-      <w:pPr>
-        <w:pStyle w:val="Heading3"/>
-        <w:keepNext w:val="0"/>
-        <w:keepLines w:val="0"/>
+        <w:t>Distinguish parameter training from prompting, configuration, and retrieval.</w:t>
+      </w:r>
+    </w:p>
+    <w:p>
+      <w:pPr>
+        <w:numPr>
+          <w:ilvl w:val="0"/>
+          <w:numId w:val="3"/>
+        </w:numPr>
+        <w:spacing w:after="240" w:before="0" w:beforeAutospacing="0" w:lineRule="auto"/>
+        <w:ind w:left="720" w:hanging="360"/>
+        <w:rPr>
+          <w:rFonts w:ascii="Calibri" w:cs="Calibri" w:eastAsia="Calibri" w:hAnsi="Calibri"/>
+          <w:sz w:val="22"/>
+          <w:szCs w:val="22"/>
+        </w:rPr>
+      </w:pPr>
+      <w:r>
         <w:rPr>
           <w:rFonts w:ascii="Calibri" w:cs="Calibri" w:eastAsia="Calibri" w:hAnsi="Calibri"/>
           <w:sz w:val="26"/>
           <w:szCs w:val="26"/>
-        </w:rPr>
-      </w:pPr>
-      <w:bookmarkStart w:colFirst="0" w:colLast="0" w:name="_p5rtzcl48r31" w:id="3"/>
-      <w:bookmarkEnd w:id="3"/>
-      <w:r>
-        <w:rPr>
-          <w:rFonts w:ascii="Calibri" w:cs="Calibri" w:eastAsia="Calibri" w:hAnsi="Calibri"/>
-          <w:sz w:val="26"/>
-          <w:szCs w:val="26"/>
-          <w:rtl w:val="0"/>
-        </w:rPr>
-        <w:t xml:space="preserve">Module 2: The Art of Prompt Engineering</w:t>
+          <w:rtl w:val="0"/>
+        </w:rPr>
+        <w:t>Implement bounded tool-use loops and a minimal Model Context Protocol teaching server.</w:t>
       </w:r>
     </w:p>
     <w:p>
@@ -1365,7 +1310,7 @@
           <w:szCs w:val="22"/>
           <w:rtl w:val="0"/>
         </w:rPr>
-        <w:t xml:space="preserve">Deciphering the Essence of a Prompt: What is a prompt, and how can it be tailored to your needs?</w:t>
+        <w:t>Diagnose shared-memory and multi-agent failures with reproducible traces.</w:t>
       </w:r>
     </w:p>
     <w:p>
@@ -1389,7 +1334,7 @@
           <w:szCs w:val="22"/>
           <w:rtl w:val="0"/>
         </w:rPr>
-        <w:t xml:space="preserve">Exploring Prompt Patterns: Unraveling the Persona Pattern, Question Refinement Pattern, Cognitive Verifier Pattern, Audience Persona Pattern, and more.</w:t>
+        <w:t>Design human approval gates tied to specific proposals, authority, and evidence.</w:t>
       </w:r>
     </w:p>
     <w:p>
@@ -1413,7 +1358,7 @@
           <w:szCs w:val="22"/>
           <w:rtl w:val="0"/>
         </w:rPr>
-        <w:t xml:space="preserve">Applying Prompt Patterns: Crafting prompts for various scenarios, including Few-shot Examples, Chain of Thought Prompting, and Game Play Patterns.</w:t>
+        <w:t>Deliver and defend a supervised Claude project with reproducible artifacts.</w:t>
       </w:r>
     </w:p>
     <w:p>
@@ -1436,7 +1381,7 @@
           <w:szCs w:val="22"/>
           <w:rtl w:val="0"/>
         </w:rPr>
-        <w:t xml:space="preserve">Delivered via YouTube video theory under this course's flipped-classroom model. In-class time in Weeks 3–8 is reserved for hands-on agentic-tool work — see Course Schedule.</w:t>
+        <w:t>Students are not required to provide private chain-of-thought. They must provide inspectable artifacts, concise reasoning summaries, test evidence, and honest descriptions of what was and was not verified.</w:t>
       </w:r>
     </w:p>
     <w:p>
@@ -1450,8 +1395,6 @@
           <w:szCs w:val="26"/>
         </w:rPr>
       </w:pPr>
-      <w:bookmarkStart w:colFirst="0" w:colLast="0" w:name="_iump316f04if" w:id="4"/>
-      <w:bookmarkEnd w:id="4"/>
       <w:r>
         <w:rPr>
           <w:rFonts w:ascii="Calibri" w:cs="Calibri" w:eastAsia="Calibri" w:hAnsi="Calibri"/>
@@ -1459,7 +1402,7 @@
           <w:szCs w:val="26"/>
           <w:rtl w:val="0"/>
         </w:rPr>
-        <w:t xml:space="preserve">Module 3: Advanced Integration Techniques for LLMs</w:t>
+        <w:t>Course Pedagogy</w:t>
       </w:r>
     </w:p>
     <w:p>
@@ -1478,7 +1421,7 @@
           <w:szCs w:val="22"/>
           <w:rtl w:val="0"/>
         </w:rPr>
-        <w:t xml:space="preserve">This module delves into sophisticated methods for augmenting LLMs with vector databases and LangChain. It covers the essentials of vector databases, including their significance in handling high-dimensional data and the process of embedding textual data for enhanced semantic search capabilities. Additionally, the module explores the creation of semantic search applications, focusing on best practices for indexing and querying.</w:t>
+        <w:t>Each lesson follows Predict, Build It, Use It, Ship It, Verify. Students predict behavior before running code, implement a small mechanism, apply or critique it with Claude, ship an inspectable artifact, and verify claims against tests, tools, and sources.</w:t>
       </w:r>
     </w:p>
     <w:p>
@@ -1497,7 +1440,7 @@
           <w:szCs w:val="22"/>
           <w:rtl w:val="0"/>
         </w:rPr>
-        <w:t xml:space="preserve">In the segment on LangChain, learners will explore its architecture and utility in building advanced LLM applications, alongside practical setup guidance and development of applications that integrate LLM capabilities with external data sources and APIs. The module also addresses advanced techniques and best practices for LangChain use, culminating in case studies that highlight real-world implementations and solutions to encountered challenges.</w:t>
+        <w:t>The reference implementation is an inspectable solution, not a substitute for the student's own attempt. Students should be able to trace the code, explain failure cases, distinguish an actual Claude run from an offline fixture or simulation, and identify what remains uncertain.</w:t>
       </w:r>
     </w:p>
     <w:p>
@@ -1520,7 +1463,7 @@
           <w:szCs w:val="22"/>
           <w:rtl w:val="0"/>
         </w:rPr>
-        <w:t xml:space="preserve">Delivered via YouTube video theory under this course's flipped-classroom model. In-class time in Weeks 3–8 is reserved for hands-on agentic-tool work — see Course Schedule.</w:t>
+        <w:t>Short instructor videos and assigned reading prepare students for class. Class time is used to build, inspect, break, revise, and explain working systems.</w:t>
       </w:r>
     </w:p>
     <w:p>
@@ -1534,8 +1477,6 @@
           <w:szCs w:val="26"/>
         </w:rPr>
       </w:pPr>
-      <w:bookmarkStart w:colFirst="0" w:colLast="0" w:name="_euzrmr8cpk5x" w:id="5"/>
-      <w:bookmarkEnd w:id="5"/>
       <w:r>
         <w:rPr>
           <w:rFonts w:ascii="Calibri" w:cs="Calibri" w:eastAsia="Calibri" w:hAnsi="Calibri"/>
@@ -1543,7 +1484,7 @@
           <w:szCs w:val="26"/>
           <w:rtl w:val="0"/>
         </w:rPr>
-        <w:t xml:space="preserve">Module 4: Fine-Tuning and Configuring LLMs</w:t>
+        <w:t>Course Scope</w:t>
       </w:r>
     </w:p>
     <w:p>
@@ -1567,7 +1508,7 @@
           <w:szCs w:val="22"/>
           <w:rtl w:val="0"/>
         </w:rPr>
-        <w:t xml:space="preserve">Pre-training Large Language Models: Unpacking the computational challenges, scaling laws, and domain-specific training.</w:t>
+        <w:t>Weeks 1 through 2 establish randomness, first prompts, contracts, and held-out evaluation. Weeks 3 through 8 move from chat to bounded agents, tools, permissions, Claude Code review, retrieval, Cowork, and Model Context Protocol mechanics.</w:t>
       </w:r>
     </w:p>
     <w:p>
@@ -1591,7 +1532,7 @@
           <w:szCs w:val="22"/>
           <w:rtl w:val="0"/>
         </w:rPr>
-        <w:t xml:space="preserve">Instruction Fine-Tuning: Mastering single and multi-task instruction fine-tuning, scaling instruct models, and evaluating model performance.</w:t>
+        <w:t>Week 9 distinguishes parameter training from prompting and configuration through a tiny logistic classifier whose loss and gradient can be inspected directly.</w:t>
       </w:r>
     </w:p>
     <w:p>
@@ -1615,7 +1556,7 @@
           <w:szCs w:val="22"/>
           <w:rtl w:val="0"/>
         </w:rPr>
-        <w:t xml:space="preserve">Reinforcement Learning and LLM-Powered Applications: Aligning models with human values, obtaining feedback, and optimizing for deployment.</w:t>
+        <w:t>Weeks 10 through 15 transfer the mechanisms to planning, tool verification, shared memory, multiple agents, evaluation, approval gates, team governance, and a supervised capstone in a real approved context.</w:t>
       </w:r>
     </w:p>
     <w:p>
@@ -1629,8 +1570,6 @@
           <w:szCs w:val="26"/>
         </w:rPr>
       </w:pPr>
-      <w:bookmarkStart w:colFirst="0" w:colLast="0" w:name="_h5olfxcipw19" w:id="6"/>
-      <w:bookmarkEnd w:id="6"/>
       <w:r>
         <w:rPr>
           <w:rFonts w:ascii="Calibri" w:cs="Calibri" w:eastAsia="Calibri" w:hAnsi="Calibri"/>
@@ -1638,7 +1577,7 @@
           <w:szCs w:val="26"/>
           <w:rtl w:val="0"/>
         </w:rPr>
-        <w:t xml:space="preserve">Module 5: Agentic AI Systems</w:t>
+        <w:t>Interpretive Lenses</w:t>
       </w:r>
     </w:p>
     <w:p>
@@ -1662,7 +1601,7 @@
           <w:szCs w:val="22"/>
           <w:rtl w:val="0"/>
         </w:rPr>
-        <w:t xml:space="preserve">Foundations of Agentic AI: Understanding autonomous AI systems that can perceive, reason, and take actions to achieve specific goals.</w:t>
+        <w:t>Anthropic: where relevant, lessons point to Anthropic's own technical guidance so students can compare the constructed mechanism with the provider's documented practice.</w:t>
       </w:r>
     </w:p>
     <w:p>
@@ -1686,7 +1625,7 @@
           <w:szCs w:val="22"/>
           <w:rtl w:val="0"/>
         </w:rPr>
-        <w:t xml:space="preserve">Agent Architectures: Exploring different frameworks for building AI agents, including ReAct (Reasoning and Acting), ReflexionGPT, and Chain-of-Thought based agents.</w:t>
+        <w:t>Computational Skepticism: where relevant, lessons separate execution evidence, source support, simulation, and inference rather than treating fluent output as proof.</w:t>
       </w:r>
     </w:p>
     <w:p>
@@ -1710,7 +1649,7 @@
           <w:szCs w:val="22"/>
           <w:rtl w:val="0"/>
         </w:rPr>
-        <w:t xml:space="preserve">Tool Use and Function Calling: Implementing mechanisms for LLMs to interact with external tools, APIs, and data sources.</w:t>
+        <w:t>Conducting AI: where relevant, lessons examine orchestration, pacing, handoffs, constraints, and how a human coordinates model and tool capabilities.</w:t>
       </w:r>
     </w:p>
     <w:p>
@@ -1734,7 +1673,7 @@
           <w:szCs w:val="22"/>
           <w:rtl w:val="0"/>
         </w:rPr>
-        <w:t xml:space="preserve">Planning and Reasoning: Building agents with strategic planning capabilities and sophisticated reasoning mechanisms.</w:t>
+        <w:t>Irreducibly Human: where relevant, lessons state what AI should do and what the human should do. AI performs bounded computation, drafting, retrieval, and transformation; humans establish purpose, authority, responsibility, consent, judgment, and final approval.</w:t>
       </w:r>
     </w:p>
     <w:p>
@@ -1758,7 +1697,7 @@
           <w:szCs w:val="22"/>
           <w:rtl w:val="0"/>
         </w:rPr>
-        <w:t xml:space="preserve">Memory Systems for Agents: Designing short-term and long-term memory solutions to enhance agent capabilities.</w:t>
+        <w:t>These notes appear only when they clarify a lesson. They are not decorative requirements and do not replace implementation or evidence.</w:t>
       </w:r>
     </w:p>
     <w:p>
@@ -1782,7 +1721,7 @@
           <w:szCs w:val="22"/>
           <w:rtl w:val="0"/>
         </w:rPr>
-        <w:t xml:space="preserve">Multi-Agent Systems: Creating collaborative environments where multiple specialized agents work together to solve complex problems.</w:t>
+        <w:t>The course does not recreate Claude's proprietary model, claim access to its weights, or treat a managed interface as evidence that students understand the underlying mechanism.</w:t>
       </w:r>
     </w:p>
     <w:p>
@@ -1806,7 +1745,7 @@
           <w:szCs w:val="22"/>
           <w:rtl w:val="0"/>
         </w:rPr>
-        <w:t xml:space="preserve">Agent Evaluation and Benchmarking: Methods for testing and measuring agent performance across various dimensions.</w:t>
+        <w:t>Exercises use controlled repositories and files before students transfer the same controls to broader settings.</w:t>
       </w:r>
     </w:p>
     <w:p>
@@ -1830,7 +1769,7 @@
           <w:szCs w:val="22"/>
           <w:rtl w:val="0"/>
         </w:rPr>
-        <w:t xml:space="preserve">Ethical Considerations in Agentic AI: Addressing alignment, safety, and societal implications of autonomous AI systems.</w:t>
+        <w:t>External integrations must remain inside the instructor-approved data and action boundary.</w:t>
       </w:r>
     </w:p>
     <w:p>
@@ -1853,27 +1792,7 @@
           <w:szCs w:val="22"/>
           <w:rtl w:val="0"/>
         </w:rPr>
-        <w:t xml:space="preserve">Architecture/theory topics above are delivered via YouTube video theory from a second required text. In-class practice in Weeks 10–14 pairs each topic with a supervision chapter from</w:t>
-      </w:r>
-      <w:r>
-        <w:rPr>
-          <w:rFonts w:ascii="Calibri" w:cs="Calibri" w:eastAsia="Calibri" w:hAnsi="Calibri"/>
-          <w:sz w:val="22"/>
-          <w:szCs w:val="22"/>
-          <w:rtl w:val="0"/>
-        </w:rPr>
-        <w:t xml:space="preserve"> Claude Agentic AI </w:t>
-      </w:r>
-      <w:r>
-        <w:rPr>
-          <w:rFonts w:ascii="Calibri" w:cs="Calibri" w:eastAsia="Calibri" w:hAnsi="Calibri"/>
-          <w:i w:val="1"/>
-          <w:iCs w:val="1"/>
-          <w:sz w:val="22"/>
-          <w:szCs w:val="22"/>
-          <w:rtl w:val="0"/>
-        </w:rPr>
-        <w:t xml:space="preserve">— see Course Schedule.</w:t>
+        <w:t>The capstone integrates the semester's mechanisms in one evidence chain with explicit human review and handoff.</w:t>
       </w:r>
     </w:p>
     <w:p>
@@ -1906,8 +1825,6 @@
           <w:szCs w:val="34"/>
         </w:rPr>
       </w:pPr>
-      <w:bookmarkStart w:colFirst="0" w:colLast="0" w:name="_ghz6cvn80sl9" w:id="7"/>
-      <w:bookmarkEnd w:id="7"/>
       <w:r>
         <w:rPr>
           <w:rFonts w:ascii="Calibri" w:cs="Calibri" w:eastAsia="Calibri" w:hAnsi="Calibri"/>
@@ -1915,7 +1832,7 @@
           <w:szCs w:val="34"/>
           <w:rtl w:val="0"/>
         </w:rPr>
-        <w:t xml:space="preserve">Course Schedule (in-class sessions)</w:t>
+        <w:t>Course Schedule</w:t>
       </w:r>
     </w:p>
     <w:p>
@@ -1934,7 +1851,7 @@
           <w:szCs w:val="22"/>
           <w:rtl w:val="0"/>
         </w:rPr>
-        <w:t xml:space="preserve">This course runs flipped: theory lives in bite-sized videos on the instructor's YouTube channel, class time is for hands-on work. The table below is what happens in class, not the full curriculum. Weeks 3–8 are agentic-tool work on the student's own controlled systems (Claude Code on their own repo, Cowork on their own files, MCP servers they evaluate themselves). Weeks 10–15 are the "in the wild" back half — multi-agent, shared memory, team/organizational context, real evaluation and ethics questions.</w:t>
+        <w:t>The course is flipped. Theory is prepared through short videos and readings; class time is for the weekly build. The artifacts listed below are ungraded Assessments used to learn and prepare for graded Assignments. Canvas publishes the exact Assignment dates and the Assessments included in each ten-day submission.</w:t>
       </w:r>
     </w:p>
     <w:tbl>
@@ -1954,10 +1871,10 @@
         <w:tblLook w:val="0600"/>
       </w:tblPr>
       <w:tblGrid>
-        <w:gridCol w:w="766.4278403275332"/>
-        <w:gridCol w:w="1154.431934493347"/>
-        <w:gridCol w:w="3583.050153531218"/>
-        <w:gridCol w:w="3856.090071647902"/>
+        <w:gridCol w:w="792"/>
+        <w:gridCol w:w="2232"/>
+        <w:gridCol w:w="3672"/>
+        <w:gridCol w:w="2664"/>
         <w:tblGridChange w:id="0">
           <w:tblGrid>
             <w:gridCol w:w="766.4278403275332"/>
@@ -1975,6 +1892,7 @@
         </w:trPr>
         <w:tc>
           <w:tcPr>
+            <w:tcW w:type="dxa" w:w="792"/>
             <w:tcBorders>
               <w:top w:color="000000" w:space="0" w:sz="0" w:val="nil"/>
               <w:left w:color="000000" w:space="0" w:sz="0" w:val="nil"/>
@@ -2008,17 +1926,13 @@
                 <w:szCs w:val="22"/>
                 <w:rtl w:val="0"/>
               </w:rPr>
-              <w:t xml:space="preserve">Week</w:t>
-            </w:r>
-            <w:r>
-              <w:rPr>
-                <w:rtl w:val="0"/>
-              </w:rPr>
+              <w:t>Week</w:t>
             </w:r>
           </w:p>
         </w:tc>
         <w:tc>
           <w:tcPr>
+            <w:tcW w:type="dxa" w:w="2232"/>
             <w:tcBorders>
               <w:top w:color="000000" w:space="0" w:sz="0" w:val="nil"/>
               <w:left w:color="000000" w:space="0" w:sz="0" w:val="nil"/>
@@ -2052,17 +1966,13 @@
                 <w:szCs w:val="22"/>
                 <w:rtl w:val="0"/>
               </w:rPr>
-              <w:t xml:space="preserve">Module</w:t>
-            </w:r>
-            <w:r>
-              <w:rPr>
-                <w:rtl w:val="0"/>
-              </w:rPr>
+              <w:t>Lesson</w:t>
             </w:r>
           </w:p>
         </w:tc>
         <w:tc>
           <w:tcPr>
+            <w:tcW w:type="dxa" w:w="3672"/>
             <w:tcBorders>
               <w:top w:color="000000" w:space="0" w:sz="0" w:val="nil"/>
               <w:left w:color="000000" w:space="0" w:sz="0" w:val="nil"/>
@@ -2096,17 +2006,13 @@
                 <w:szCs w:val="22"/>
                 <w:rtl w:val="0"/>
               </w:rPr>
-              <w:t xml:space="preserve">Topic</w:t>
-            </w:r>
-            <w:r>
-              <w:rPr>
-                <w:rtl w:val="0"/>
-              </w:rPr>
+              <w:t>In-class mechanism</w:t>
             </w:r>
           </w:p>
         </w:tc>
         <w:tc>
           <w:tcPr>
+            <w:tcW w:type="dxa" w:w="2664"/>
             <w:tcBorders>
               <w:top w:color="000000" w:space="0" w:sz="0" w:val="nil"/>
               <w:left w:color="000000" w:space="0" w:sz="0" w:val="nil"/>
@@ -2140,12 +2046,7 @@
                 <w:szCs w:val="22"/>
                 <w:rtl w:val="0"/>
               </w:rPr>
-              <w:t xml:space="preserve">Hands-on</w:t>
-            </w:r>
-            <w:r>
-              <w:rPr>
-                <w:rtl w:val="0"/>
-              </w:rPr>
+              <w:t>Ungraded Assessment artifact</w:t>
             </w:r>
           </w:p>
         </w:tc>
@@ -2158,6 +2059,7 @@
         </w:trPr>
         <w:tc>
           <w:tcPr>
+            <w:tcW w:type="dxa" w:w="792"/>
             <w:tcBorders>
               <w:top w:color="000000" w:space="0" w:sz="0" w:val="nil"/>
               <w:left w:color="000000" w:space="0" w:sz="0" w:val="nil"/>
@@ -2188,12 +2090,13 @@
                 <w:szCs w:val="22"/>
                 <w:rtl w:val="0"/>
               </w:rPr>
-              <w:t xml:space="preserve">1</w:t>
+              <w:t>1</w:t>
             </w:r>
           </w:p>
         </w:tc>
         <w:tc>
           <w:tcPr>
+            <w:tcW w:type="dxa" w:w="2232"/>
             <w:tcBorders>
               <w:top w:color="000000" w:space="0" w:sz="0" w:val="nil"/>
               <w:left w:color="000000" w:space="0" w:sz="0" w:val="nil"/>
@@ -2224,12 +2127,13 @@
                 <w:szCs w:val="22"/>
                 <w:rtl w:val="0"/>
               </w:rPr>
-              <w:t xml:space="preserve">1</w:t>
+              <w:t>Randomness and first prompts</w:t>
             </w:r>
           </w:p>
         </w:tc>
         <w:tc>
           <w:tcPr>
+            <w:tcW w:type="dxa" w:w="3672"/>
             <w:tcBorders>
               <w:top w:color="000000" w:space="0" w:sz="0" w:val="nil"/>
               <w:left w:color="000000" w:space="0" w:sz="0" w:val="nil"/>
@@ -2260,12 +2164,13 @@
                 <w:szCs w:val="22"/>
                 <w:rtl w:val="0"/>
               </w:rPr>
-              <w:t xml:space="preserve">Unveiling LLMs — capabilities, use cases, historical context. Understanding randomness in output.</w:t>
+              <w:t>Probability normalization, temperature, controlled prompt trials</w:t>
             </w:r>
           </w:p>
         </w:tc>
         <w:tc>
           <w:tcPr>
+            <w:tcW w:type="dxa" w:w="2664"/>
             <w:tcBorders>
               <w:top w:color="000000" w:space="0" w:sz="0" w:val="nil"/>
               <w:left w:color="000000" w:space="0" w:sz="0" w:val="nil"/>
@@ -2296,7 +2201,7 @@
                 <w:szCs w:val="22"/>
                 <w:rtl w:val="0"/>
               </w:rPr>
-              <w:t xml:space="preserve">Creating first prompts.</w:t>
+              <w:t>Sampling report</w:t>
             </w:r>
           </w:p>
         </w:tc>
@@ -2309,6 +2214,7 @@
         </w:trPr>
         <w:tc>
           <w:tcPr>
+            <w:tcW w:type="dxa" w:w="792"/>
             <w:tcBorders>
               <w:top w:color="000000" w:space="0" w:sz="0" w:val="nil"/>
               <w:left w:color="000000" w:space="0" w:sz="0" w:val="nil"/>
@@ -2339,12 +2245,13 @@
                 <w:szCs w:val="22"/>
                 <w:rtl w:val="0"/>
               </w:rPr>
-              <w:t xml:space="preserve">2</w:t>
+              <w:t>2</w:t>
             </w:r>
           </w:p>
         </w:tc>
         <w:tc>
           <w:tcPr>
+            <w:tcW w:type="dxa" w:w="2232"/>
             <w:tcBorders>
               <w:top w:color="000000" w:space="0" w:sz="0" w:val="nil"/>
               <w:left w:color="000000" w:space="0" w:sz="0" w:val="nil"/>
@@ -2375,12 +2282,13 @@
                 <w:szCs w:val="22"/>
                 <w:rtl w:val="0"/>
               </w:rPr>
-              <w:t xml:space="preserve">1</w:t>
+              <w:t>Prompt contracts and evaluation</w:t>
             </w:r>
           </w:p>
         </w:tc>
         <w:tc>
           <w:tcPr>
+            <w:tcW w:type="dxa" w:w="3672"/>
             <w:tcBorders>
               <w:top w:color="000000" w:space="0" w:sz="0" w:val="nil"/>
               <w:left w:color="000000" w:space="0" w:sz="0" w:val="nil"/>
@@ -2411,12 +2319,13 @@
                 <w:szCs w:val="22"/>
                 <w:rtl w:val="0"/>
               </w:rPr>
-              <w:t xml:space="preserve">Creating Your First Prompts — hands-on initiation into AI-powered content generation.</w:t>
+              <w:t>Contracts, validation, held-out cases, source support</w:t>
             </w:r>
           </w:p>
         </w:tc>
         <w:tc>
           <w:tcPr>
+            <w:tcW w:type="dxa" w:w="2664"/>
             <w:tcBorders>
               <w:top w:color="000000" w:space="0" w:sz="0" w:val="nil"/>
               <w:left w:color="000000" w:space="0" w:sz="0" w:val="nil"/>
@@ -2447,7 +2356,7 @@
                 <w:szCs w:val="22"/>
                 <w:rtl w:val="0"/>
               </w:rPr>
-              <w:t xml:space="preserve">Continued from Week 1.</w:t>
+              <w:t>Prompt experiment</w:t>
             </w:r>
           </w:p>
         </w:tc>
@@ -2460,6 +2369,7 @@
         </w:trPr>
         <w:tc>
           <w:tcPr>
+            <w:tcW w:type="dxa" w:w="792"/>
             <w:tcBorders>
               <w:top w:color="000000" w:space="0" w:sz="0" w:val="nil"/>
               <w:left w:color="000000" w:space="0" w:sz="0" w:val="nil"/>
@@ -2490,12 +2400,13 @@
                 <w:szCs w:val="22"/>
                 <w:rtl w:val="0"/>
               </w:rPr>
-              <w:t xml:space="preserve">3</w:t>
+              <w:t>3</w:t>
             </w:r>
           </w:p>
         </w:tc>
         <w:tc>
           <w:tcPr>
+            <w:tcW w:type="dxa" w:w="2232"/>
             <w:tcBorders>
               <w:top w:color="000000" w:space="0" w:sz="0" w:val="nil"/>
               <w:left w:color="000000" w:space="0" w:sz="0" w:val="nil"/>
@@ -2526,12 +2437,13 @@
                 <w:szCs w:val="22"/>
                 <w:rtl w:val="0"/>
               </w:rPr>
-              <w:t xml:space="preserve">Book Ch.1</w:t>
+              <w:t>Chat, assistant, and agent</w:t>
             </w:r>
           </w:p>
         </w:tc>
         <w:tc>
           <w:tcPr>
+            <w:tcW w:type="dxa" w:w="3672"/>
             <w:tcBorders>
               <w:top w:color="000000" w:space="0" w:sz="0" w:val="nil"/>
               <w:left w:color="000000" w:space="0" w:sz="0" w:val="nil"/>
@@ -2562,12 +2474,13 @@
                 <w:szCs w:val="22"/>
                 <w:rtl w:val="0"/>
               </w:rPr>
-              <w:t xml:space="preserve">Chatbot, Assistant, Agent — the see/decide/do framework.</w:t>
+              <w:t>Compare response, read, and write action surfaces</w:t>
             </w:r>
           </w:p>
         </w:tc>
         <w:tc>
           <w:tcPr>
+            <w:tcW w:type="dxa" w:w="2664"/>
             <w:tcBorders>
               <w:top w:color="000000" w:space="0" w:sz="0" w:val="nil"/>
               <w:left w:color="000000" w:space="0" w:sz="0" w:val="nil"/>
@@ -2598,7 +2511,7 @@
                 <w:szCs w:val="22"/>
                 <w:rtl w:val="0"/>
               </w:rPr>
-              <w:t xml:space="preserve">Same task, three ways: chat, upload+ask, Claude Code. Compare what changed in the world at each step.</w:t>
+              <w:t>Action surface comparison</w:t>
             </w:r>
           </w:p>
         </w:tc>
@@ -2611,6 +2524,7 @@
         </w:trPr>
         <w:tc>
           <w:tcPr>
+            <w:tcW w:type="dxa" w:w="792"/>
             <w:tcBorders>
               <w:top w:color="000000" w:space="0" w:sz="0" w:val="nil"/>
               <w:left w:color="000000" w:space="0" w:sz="0" w:val="nil"/>
@@ -2641,12 +2555,13 @@
                 <w:szCs w:val="22"/>
                 <w:rtl w:val="0"/>
               </w:rPr>
-              <w:t xml:space="preserve">4</w:t>
+              <w:t>4</w:t>
             </w:r>
           </w:p>
         </w:tc>
         <w:tc>
           <w:tcPr>
+            <w:tcW w:type="dxa" w:w="2232"/>
             <w:tcBorders>
               <w:top w:color="000000" w:space="0" w:sz="0" w:val="nil"/>
               <w:left w:color="000000" w:space="0" w:sz="0" w:val="nil"/>
@@ -2677,12 +2592,13 @@
                 <w:szCs w:val="22"/>
                 <w:rtl w:val="0"/>
               </w:rPr>
-              <w:t xml:space="preserve">Book Ch.2</w:t>
+              <w:t>The agent loop</w:t>
             </w:r>
           </w:p>
         </w:tc>
         <w:tc>
           <w:tcPr>
+            <w:tcW w:type="dxa" w:w="3672"/>
             <w:tcBorders>
               <w:top w:color="000000" w:space="0" w:sz="0" w:val="nil"/>
               <w:left w:color="000000" w:space="0" w:sz="0" w:val="nil"/>
@@ -2713,12 +2629,13 @@
                 <w:szCs w:val="22"/>
                 <w:rtl w:val="0"/>
               </w:rPr>
-              <w:t xml:space="preserve">The Agentic Loop — observe, plan, act, check, report.</w:t>
+              <w:t>Bounded observe, decide, act, record, and stop controller</w:t>
             </w:r>
           </w:p>
         </w:tc>
         <w:tc>
           <w:tcPr>
+            <w:tcW w:type="dxa" w:w="2664"/>
             <w:tcBorders>
               <w:top w:color="000000" w:space="0" w:sz="0" w:val="nil"/>
               <w:left w:color="000000" w:space="0" w:sz="0" w:val="nil"/>
@@ -2749,7 +2666,7 @@
                 <w:szCs w:val="22"/>
                 <w:rtl w:val="0"/>
               </w:rPr>
-              <w:t xml:space="preserve">Trace a Claude Code bug-fix loop and a Cowork document-assembly loop side by side.</w:t>
+              <w:t>Agent trace</w:t>
             </w:r>
           </w:p>
         </w:tc>
@@ -2762,6 +2679,7 @@
         </w:trPr>
         <w:tc>
           <w:tcPr>
+            <w:tcW w:type="dxa" w:w="792"/>
             <w:tcBorders>
               <w:top w:color="000000" w:space="0" w:sz="0" w:val="nil"/>
               <w:left w:color="000000" w:space="0" w:sz="0" w:val="nil"/>
@@ -2792,12 +2710,13 @@
                 <w:szCs w:val="22"/>
                 <w:rtl w:val="0"/>
               </w:rPr>
-              <w:t xml:space="preserve">5</w:t>
+              <w:t>5</w:t>
             </w:r>
           </w:p>
         </w:tc>
         <w:tc>
           <w:tcPr>
+            <w:tcW w:type="dxa" w:w="2232"/>
             <w:tcBorders>
               <w:top w:color="000000" w:space="0" w:sz="0" w:val="nil"/>
               <w:left w:color="000000" w:space="0" w:sz="0" w:val="nil"/>
@@ -2828,12 +2747,13 @@
                 <w:szCs w:val="22"/>
                 <w:rtl w:val="0"/>
               </w:rPr>
-              <w:t xml:space="preserve">Book Ch.3</w:t>
+              <w:t>Tools, permissions, and boundaries</w:t>
             </w:r>
           </w:p>
         </w:tc>
         <w:tc>
           <w:tcPr>
+            <w:tcW w:type="dxa" w:w="3672"/>
             <w:tcBorders>
               <w:top w:color="000000" w:space="0" w:sz="0" w:val="nil"/>
               <w:left w:color="000000" w:space="0" w:sz="0" w:val="nil"/>
@@ -2864,12 +2784,13 @@
                 <w:szCs w:val="22"/>
                 <w:rtl w:val="0"/>
               </w:rPr>
-              <w:t xml:space="preserve">Tools, Permissions, and the Action Surface — least privilege, the access ladder.</w:t>
+              <w:t>Path containment, least privilege, and write approval</w:t>
             </w:r>
           </w:p>
         </w:tc>
         <w:tc>
           <w:tcPr>
+            <w:tcW w:type="dxa" w:w="2664"/>
             <w:tcBorders>
               <w:top w:color="000000" w:space="0" w:sz="0" w:val="nil"/>
               <w:left w:color="000000" w:space="0" w:sz="0" w:val="nil"/>
@@ -2900,7 +2821,7 @@
                 <w:szCs w:val="22"/>
                 <w:rtl w:val="0"/>
               </w:rPr>
-              <w:t xml:space="preserve">Design an action surface for a real task; identify the dangerous middle.</w:t>
+              <w:t>Permission policy</w:t>
             </w:r>
           </w:p>
         </w:tc>
@@ -2913,6 +2834,7 @@
         </w:trPr>
         <w:tc>
           <w:tcPr>
+            <w:tcW w:type="dxa" w:w="792"/>
             <w:tcBorders>
               <w:top w:color="000000" w:space="0" w:sz="0" w:val="nil"/>
               <w:left w:color="000000" w:space="0" w:sz="0" w:val="nil"/>
@@ -2943,12 +2865,13 @@
                 <w:szCs w:val="22"/>
                 <w:rtl w:val="0"/>
               </w:rPr>
-              <w:t xml:space="preserve">6</w:t>
+              <w:t>6</w:t>
             </w:r>
           </w:p>
         </w:tc>
         <w:tc>
           <w:tcPr>
+            <w:tcW w:type="dxa" w:w="2232"/>
             <w:tcBorders>
               <w:top w:color="000000" w:space="0" w:sz="0" w:val="nil"/>
               <w:left w:color="000000" w:space="0" w:sz="0" w:val="nil"/>
@@ -2979,12 +2902,13 @@
                 <w:szCs w:val="22"/>
                 <w:rtl w:val="0"/>
               </w:rPr>
-              <w:t xml:space="preserve">Book Ch.4</w:t>
+              <w:t>Claude Code and diff review</w:t>
             </w:r>
           </w:p>
         </w:tc>
         <w:tc>
           <w:tcPr>
+            <w:tcW w:type="dxa" w:w="3672"/>
             <w:tcBorders>
               <w:top w:color="000000" w:space="0" w:sz="0" w:val="nil"/>
               <w:left w:color="000000" w:space="0" w:sz="0" w:val="nil"/>
@@ -3015,12 +2939,13 @@
                 <w:szCs w:val="22"/>
                 <w:rtl w:val="0"/>
               </w:rPr>
-              <w:t xml:space="preserve">Claude Code as Agentic Engineering.</w:t>
+              <w:t>Issue, bounded edit, tests, diff inspection, decision</w:t>
             </w:r>
           </w:p>
         </w:tc>
         <w:tc>
           <w:tcPr>
+            <w:tcW w:type="dxa" w:w="2664"/>
             <w:tcBorders>
               <w:top w:color="000000" w:space="0" w:sz="0" w:val="nil"/>
               <w:left w:color="000000" w:space="0" w:sz="0" w:val="nil"/>
@@ -3051,7 +2976,7 @@
                 <w:szCs w:val="22"/>
                 <w:rtl w:val="0"/>
               </w:rPr>
-              <w:t xml:space="preserve">Issue → plan review → bounded edit → diff inspection → merge decision, on a real repo.</w:t>
+              <w:t>Review packet</w:t>
             </w:r>
           </w:p>
         </w:tc>
@@ -3064,6 +2989,7 @@
         </w:trPr>
         <w:tc>
           <w:tcPr>
+            <w:tcW w:type="dxa" w:w="792"/>
             <w:tcBorders>
               <w:top w:color="000000" w:space="0" w:sz="0" w:val="nil"/>
               <w:left w:color="000000" w:space="0" w:sz="0" w:val="nil"/>
@@ -3094,12 +3020,13 @@
                 <w:szCs w:val="22"/>
                 <w:rtl w:val="0"/>
               </w:rPr>
-              <w:t xml:space="preserve">7</w:t>
+              <w:t>7</w:t>
             </w:r>
           </w:p>
         </w:tc>
         <w:tc>
           <w:tcPr>
+            <w:tcW w:type="dxa" w:w="2232"/>
             <w:tcBorders>
               <w:top w:color="000000" w:space="0" w:sz="0" w:val="nil"/>
               <w:left w:color="000000" w:space="0" w:sz="0" w:val="nil"/>
@@ -3130,12 +3057,13 @@
                 <w:szCs w:val="22"/>
                 <w:rtl w:val="0"/>
               </w:rPr>
-              <w:t xml:space="preserve">Book Ch.5</w:t>
+              <w:t>Context retrieval and Cowork</w:t>
             </w:r>
           </w:p>
         </w:tc>
         <w:tc>
           <w:tcPr>
+            <w:tcW w:type="dxa" w:w="3672"/>
             <w:tcBorders>
               <w:top w:color="000000" w:space="0" w:sz="0" w:val="nil"/>
               <w:left w:color="000000" w:space="0" w:sz="0" w:val="nil"/>
@@ -3166,12 +3094,13 @@
                 <w:szCs w:val="22"/>
                 <w:rtl w:val="0"/>
               </w:rPr>
-              <w:t xml:space="preserve">Claude Cowork as Agentic Knowledge Work.</w:t>
+              <w:t>Lexical vectors, source-grounded task packets, evidence checks</w:t>
             </w:r>
           </w:p>
         </w:tc>
         <w:tc>
           <w:tcPr>
+            <w:tcW w:type="dxa" w:w="2664"/>
             <w:tcBorders>
               <w:top w:color="000000" w:space="0" w:sz="0" w:val="nil"/>
               <w:left w:color="000000" w:space="0" w:sz="0" w:val="nil"/>
@@ -3202,7 +3131,7 @@
                 <w:szCs w:val="22"/>
                 <w:rtl w:val="0"/>
               </w:rPr>
-              <w:t xml:space="preserve">Build a task packet; run a Cowork document task; verify against sources.</w:t>
+              <w:t>Source-grounded task packet</w:t>
             </w:r>
           </w:p>
         </w:tc>
@@ -3215,6 +3144,7 @@
         </w:trPr>
         <w:tc>
           <w:tcPr>
+            <w:tcW w:type="dxa" w:w="792"/>
             <w:tcBorders>
               <w:top w:color="000000" w:space="0" w:sz="0" w:val="nil"/>
               <w:left w:color="000000" w:space="0" w:sz="0" w:val="nil"/>
@@ -3245,12 +3175,13 @@
                 <w:szCs w:val="22"/>
                 <w:rtl w:val="0"/>
               </w:rPr>
-              <w:t xml:space="preserve">8</w:t>
+              <w:t>8</w:t>
             </w:r>
           </w:p>
         </w:tc>
         <w:tc>
           <w:tcPr>
+            <w:tcW w:type="dxa" w:w="2232"/>
             <w:tcBorders>
               <w:top w:color="000000" w:space="0" w:sz="0" w:val="nil"/>
               <w:left w:color="000000" w:space="0" w:sz="0" w:val="nil"/>
@@ -3281,12 +3212,13 @@
                 <w:szCs w:val="22"/>
                 <w:rtl w:val="0"/>
               </w:rPr>
-              <w:t xml:space="preserve">Book Ch.6</w:t>
+              <w:t>Model Context Protocol from scratch</w:t>
             </w:r>
           </w:p>
         </w:tc>
         <w:tc>
           <w:tcPr>
+            <w:tcW w:type="dxa" w:w="3672"/>
             <w:tcBorders>
               <w:top w:color="000000" w:space="0" w:sz="0" w:val="nil"/>
               <w:left w:color="000000" w:space="0" w:sz="0" w:val="nil"/>
@@ -3317,12 +3249,13 @@
                 <w:szCs w:val="22"/>
                 <w:rtl w:val="0"/>
               </w:rPr>
-              <w:t xml:space="preserve">MCP and External Capabilities.</w:t>
+              <w:t>Initialize, readiness, tools/list, tool calls, capability review</w:t>
             </w:r>
           </w:p>
         </w:tc>
         <w:tc>
           <w:tcPr>
+            <w:tcW w:type="dxa" w:w="2664"/>
             <w:tcBorders>
               <w:top w:color="000000" w:space="0" w:sz="0" w:val="nil"/>
               <w:left w:color="000000" w:space="0" w:sz="0" w:val="nil"/>
@@ -3353,27 +3286,7 @@
                 <w:szCs w:val="22"/>
                 <w:rtl w:val="0"/>
               </w:rPr>
-              <w:t xml:space="preserve">Evaluate two MCP servers (read-only vs. write-capable) for the same task; decide whether to connect either. </w:t>
-            </w:r>
-            <w:r>
-              <w:rPr>
-                <w:rFonts w:ascii="Calibri" w:cs="Calibri" w:eastAsia="Calibri" w:hAnsi="Calibri"/>
-                <w:b w:val="1"/>
-                <w:bCs w:val="1"/>
-                <w:sz w:val="22"/>
-                <w:szCs w:val="22"/>
-                <w:rtl w:val="0"/>
-              </w:rPr>
-              <w:t xml:space="preserve">Progress Reel:</w:t>
-            </w:r>
-            <w:r>
-              <w:rPr>
-                <w:rFonts w:ascii="Calibri" w:cs="Calibri" w:eastAsia="Calibri" w:hAnsi="Calibri"/>
-                <w:sz w:val="22"/>
-                <w:szCs w:val="22"/>
-                <w:rtl w:val="0"/>
-              </w:rPr>
-              <w:t xml:space="preserve"> short video on the Weeks 3–8 work, played and discussed in class instead of a live presentation.</w:t>
+              <w:t>MCP evaluation</w:t>
             </w:r>
           </w:p>
         </w:tc>
@@ -3386,6 +3299,7 @@
         </w:trPr>
         <w:tc>
           <w:tcPr>
+            <w:tcW w:type="dxa" w:w="792"/>
             <w:tcBorders>
               <w:top w:color="000000" w:space="0" w:sz="0" w:val="nil"/>
               <w:left w:color="000000" w:space="0" w:sz="0" w:val="nil"/>
@@ -3416,12 +3330,13 @@
                 <w:szCs w:val="22"/>
                 <w:rtl w:val="0"/>
               </w:rPr>
-              <w:t xml:space="preserve">9</w:t>
+              <w:t>9</w:t>
             </w:r>
           </w:p>
         </w:tc>
         <w:tc>
           <w:tcPr>
+            <w:tcW w:type="dxa" w:w="2232"/>
             <w:tcBorders>
               <w:top w:color="000000" w:space="0" w:sz="0" w:val="nil"/>
               <w:left w:color="000000" w:space="0" w:sz="0" w:val="nil"/>
@@ -3452,12 +3367,13 @@
                 <w:szCs w:val="22"/>
                 <w:rtl w:val="0"/>
               </w:rPr>
-              <w:t xml:space="preserve">4</w:t>
+              <w:t>Training mechanics and Claude configuration</w:t>
             </w:r>
           </w:p>
         </w:tc>
         <w:tc>
           <w:tcPr>
+            <w:tcW w:type="dxa" w:w="3672"/>
             <w:tcBorders>
               <w:top w:color="000000" w:space="0" w:sz="0" w:val="nil"/>
               <w:left w:color="000000" w:space="0" w:sz="0" w:val="nil"/>
@@ -3488,12 +3404,13 @@
                 <w:szCs w:val="22"/>
                 <w:rtl w:val="0"/>
               </w:rPr>
-              <w:t xml:space="preserve">Fine-Tuning and Configuring LLMs — pre-training, instruction fine-tuning, RLHF.</w:t>
+              <w:t>Loss, gradient update, and parameter versus context changes</w:t>
             </w:r>
           </w:p>
         </w:tc>
         <w:tc>
           <w:tcPr>
+            <w:tcW w:type="dxa" w:w="2664"/>
             <w:tcBorders>
               <w:top w:color="000000" w:space="0" w:sz="0" w:val="nil"/>
               <w:left w:color="000000" w:space="0" w:sz="0" w:val="nil"/>
@@ -3524,7 +3441,7 @@
                 <w:szCs w:val="22"/>
                 <w:rtl w:val="0"/>
               </w:rPr>
-              <w:t xml:space="preserve">Unchanged from current syllabus.</w:t>
+              <w:t>Training-versus-context report</w:t>
             </w:r>
           </w:p>
         </w:tc>
@@ -3537,6 +3454,7 @@
         </w:trPr>
         <w:tc>
           <w:tcPr>
+            <w:tcW w:type="dxa" w:w="792"/>
             <w:tcBorders>
               <w:top w:color="000000" w:space="0" w:sz="0" w:val="nil"/>
               <w:left w:color="000000" w:space="0" w:sz="0" w:val="nil"/>
@@ -3567,12 +3485,13 @@
                 <w:szCs w:val="22"/>
                 <w:rtl w:val="0"/>
               </w:rPr>
-              <w:t xml:space="preserve">10</w:t>
+              <w:t>10</w:t>
             </w:r>
           </w:p>
         </w:tc>
         <w:tc>
           <w:tcPr>
+            <w:tcW w:type="dxa" w:w="2232"/>
             <w:tcBorders>
               <w:top w:color="000000" w:space="0" w:sz="0" w:val="nil"/>
               <w:left w:color="000000" w:space="0" w:sz="0" w:val="nil"/>
@@ -3603,12 +3522,13 @@
                 <w:szCs w:val="22"/>
                 <w:rtl w:val="0"/>
               </w:rPr>
-              <w:t xml:space="preserve">Module 5 + Book Ch.7</w:t>
+              <w:t>Planning before acting</w:t>
             </w:r>
           </w:p>
         </w:tc>
         <w:tc>
           <w:tcPr>
+            <w:tcW w:type="dxa" w:w="3672"/>
             <w:tcBorders>
               <w:top w:color="000000" w:space="0" w:sz="0" w:val="nil"/>
               <w:left w:color="000000" w:space="0" w:sz="0" w:val="nil"/>
@@ -3641,41 +3561,13 @@
                 <w:szCs w:val="22"/>
                 <w:rtl w:val="0"/>
               </w:rPr>
-              <w:t xml:space="preserve">Theory (video, second book):</w:t>
-            </w:r>
-            <w:r>
-              <w:rPr>
-                <w:rFonts w:ascii="Calibri" w:cs="Calibri" w:eastAsia="Calibri" w:hAnsi="Calibri"/>
-                <w:sz w:val="22"/>
-                <w:szCs w:val="22"/>
-                <w:rtl w:val="0"/>
-              </w:rPr>
-              <w:t xml:space="preserve"> Foundations of Agentic AI; Agent Architectures — ReAct, ReflexionGPT, Chain-of-Thought agents. </w:t>
-            </w:r>
-            <w:r>
-              <w:rPr>
-                <w:rFonts w:ascii="Calibri" w:cs="Calibri" w:eastAsia="Calibri" w:hAnsi="Calibri"/>
-                <w:b w:val="1"/>
-                <w:bCs w:val="1"/>
-                <w:sz w:val="22"/>
-                <w:szCs w:val="22"/>
-                <w:rtl w:val="0"/>
-              </w:rPr>
-              <w:t xml:space="preserve">In class:</w:t>
-            </w:r>
-            <w:r>
-              <w:rPr>
-                <w:rFonts w:ascii="Calibri" w:cs="Calibri" w:eastAsia="Calibri" w:hAnsi="Calibri"/>
-                <w:sz w:val="22"/>
-                <w:szCs w:val="22"/>
-                <w:rtl w:val="0"/>
-              </w:rPr>
-              <w:t xml:space="preserve"> Planning Before Acting.</w:t>
+              <w:t>Dependencies, evidence, permissions, budgets, and stop conditions</w:t>
             </w:r>
           </w:p>
         </w:tc>
         <w:tc>
           <w:tcPr>
+            <w:tcW w:type="dxa" w:w="2664"/>
             <w:tcBorders>
               <w:top w:color="000000" w:space="0" w:sz="0" w:val="nil"/>
               <w:left w:color="000000" w:space="0" w:sz="0" w:val="nil"/>
@@ -3706,7 +3598,7 @@
                 <w:szCs w:val="22"/>
                 <w:rtl w:val="0"/>
               </w:rPr>
-              <w:t xml:space="preserve">Rate a real agent plan against the eight-element checklist; connect ReAct's reason-act loop to why plan review matters.</w:t>
+              <w:t>Reviewed plan</w:t>
             </w:r>
           </w:p>
         </w:tc>
@@ -3719,6 +3611,7 @@
         </w:trPr>
         <w:tc>
           <w:tcPr>
+            <w:tcW w:type="dxa" w:w="792"/>
             <w:tcBorders>
               <w:top w:color="000000" w:space="0" w:sz="0" w:val="nil"/>
               <w:left w:color="000000" w:space="0" w:sz="0" w:val="nil"/>
@@ -3749,12 +3642,13 @@
                 <w:szCs w:val="22"/>
                 <w:rtl w:val="0"/>
               </w:rPr>
-              <w:t xml:space="preserve">11</w:t>
+              <w:t>11</w:t>
             </w:r>
           </w:p>
         </w:tc>
         <w:tc>
           <w:tcPr>
+            <w:tcW w:type="dxa" w:w="2232"/>
             <w:tcBorders>
               <w:top w:color="000000" w:space="0" w:sz="0" w:val="nil"/>
               <w:left w:color="000000" w:space="0" w:sz="0" w:val="nil"/>
@@ -3785,12 +3679,13 @@
                 <w:szCs w:val="22"/>
                 <w:rtl w:val="0"/>
               </w:rPr>
-              <w:t xml:space="preserve">Module 5 + Book Ch.8</w:t>
+              <w:t>Claude tool use and verification</w:t>
             </w:r>
           </w:p>
         </w:tc>
         <w:tc>
           <w:tcPr>
+            <w:tcW w:type="dxa" w:w="3672"/>
             <w:tcBorders>
               <w:top w:color="000000" w:space="0" w:sz="0" w:val="nil"/>
               <w:left w:color="000000" w:space="0" w:sz="0" w:val="nil"/>
@@ -3823,41 +3718,13 @@
                 <w:szCs w:val="22"/>
                 <w:rtl w:val="0"/>
               </w:rPr>
-              <w:t xml:space="preserve">Theory:</w:t>
-            </w:r>
-            <w:r>
-              <w:rPr>
-                <w:rFonts w:ascii="Calibri" w:cs="Calibri" w:eastAsia="Calibri" w:hAnsi="Calibri"/>
-                <w:sz w:val="22"/>
-                <w:szCs w:val="22"/>
-                <w:rtl w:val="0"/>
-              </w:rPr>
-              <w:t xml:space="preserve"> Tool Use and Function Calling. </w:t>
-            </w:r>
-            <w:r>
-              <w:rPr>
-                <w:rFonts w:ascii="Calibri" w:cs="Calibri" w:eastAsia="Calibri" w:hAnsi="Calibri"/>
-                <w:b w:val="1"/>
-                <w:bCs w:val="1"/>
-                <w:sz w:val="22"/>
-                <w:szCs w:val="22"/>
-                <w:rtl w:val="0"/>
-              </w:rPr>
-              <w:t xml:space="preserve">In class:</w:t>
-            </w:r>
-            <w:r>
-              <w:rPr>
-                <w:rFonts w:ascii="Calibri" w:cs="Calibri" w:eastAsia="Calibri" w:hAnsi="Calibri"/>
-                <w:sz w:val="22"/>
-                <w:szCs w:val="22"/>
-                <w:rtl w:val="0"/>
-              </w:rPr>
-              <w:t xml:space="preserve"> Verification Is the Control System.</w:t>
+              <w:t>Schema validation, dispatch, tool results, independent checking</w:t>
             </w:r>
           </w:p>
         </w:tc>
         <w:tc>
           <w:tcPr>
+            <w:tcW w:type="dxa" w:w="2664"/>
             <w:tcBorders>
               <w:top w:color="000000" w:space="0" w:sz="0" w:val="nil"/>
               <w:left w:color="000000" w:space="0" w:sz="0" w:val="nil"/>
@@ -3888,7 +3755,7 @@
                 <w:szCs w:val="22"/>
                 <w:rtl w:val="0"/>
               </w:rPr>
-              <w:t xml:space="preserve">Apply the evidence matrix to outputs from a tool-calling agent.</w:t>
+              <w:t>Tool evidence matrix</w:t>
             </w:r>
           </w:p>
         </w:tc>
@@ -3901,6 +3768,7 @@
         </w:trPr>
         <w:tc>
           <w:tcPr>
+            <w:tcW w:type="dxa" w:w="792"/>
             <w:tcBorders>
               <w:top w:color="000000" w:space="0" w:sz="0" w:val="nil"/>
               <w:left w:color="000000" w:space="0" w:sz="0" w:val="nil"/>
@@ -3931,12 +3799,13 @@
                 <w:szCs w:val="22"/>
                 <w:rtl w:val="0"/>
               </w:rPr>
-              <w:t xml:space="preserve">12</w:t>
+              <w:t>12</w:t>
             </w:r>
           </w:p>
         </w:tc>
         <w:tc>
           <w:tcPr>
+            <w:tcW w:type="dxa" w:w="2232"/>
             <w:tcBorders>
               <w:top w:color="000000" w:space="0" w:sz="0" w:val="nil"/>
               <w:left w:color="000000" w:space="0" w:sz="0" w:val="nil"/>
@@ -3967,12 +3836,13 @@
                 <w:szCs w:val="22"/>
                 <w:rtl w:val="0"/>
               </w:rPr>
-              <w:t xml:space="preserve">Module 5 + Book Ch.9</w:t>
+              <w:t>Memory and multiple agents</w:t>
             </w:r>
           </w:p>
         </w:tc>
         <w:tc>
           <w:tcPr>
+            <w:tcW w:type="dxa" w:w="3672"/>
             <w:tcBorders>
               <w:top w:color="000000" w:space="0" w:sz="0" w:val="nil"/>
               <w:left w:color="000000" w:space="0" w:sz="0" w:val="nil"/>
@@ -4005,41 +3875,13 @@
                 <w:szCs w:val="22"/>
                 <w:rtl w:val="0"/>
               </w:rPr>
-              <w:t xml:space="preserve">Theory:</w:t>
-            </w:r>
-            <w:r>
-              <w:rPr>
-                <w:rFonts w:ascii="Calibri" w:cs="Calibri" w:eastAsia="Calibri" w:hAnsi="Calibri"/>
-                <w:sz w:val="22"/>
-                <w:szCs w:val="22"/>
-                <w:rtl w:val="0"/>
-              </w:rPr>
-              <w:t xml:space="preserve"> Memory Systems for Agents; Multi-Agent Systems — collaborative environments, "in the wild" rather than on a single controlled system. </w:t>
-            </w:r>
-            <w:r>
-              <w:rPr>
-                <w:rFonts w:ascii="Calibri" w:cs="Calibri" w:eastAsia="Calibri" w:hAnsi="Calibri"/>
-                <w:b w:val="1"/>
-                <w:bCs w:val="1"/>
-                <w:sz w:val="22"/>
-                <w:szCs w:val="22"/>
-                <w:rtl w:val="0"/>
-              </w:rPr>
-              <w:t xml:space="preserve">In class:</w:t>
-            </w:r>
-            <w:r>
-              <w:rPr>
-                <w:rFonts w:ascii="Calibri" w:cs="Calibri" w:eastAsia="Calibri" w:hAnsi="Calibri"/>
-                <w:sz w:val="22"/>
-                <w:szCs w:val="22"/>
-                <w:rtl w:val="0"/>
-              </w:rPr>
-              <w:t xml:space="preserve"> Failure Modes of Agentic Work.</w:t>
+              <w:t>Versioned shared memory, stale writes, conflict diagnosis</w:t>
             </w:r>
           </w:p>
         </w:tc>
         <w:tc>
           <w:tcPr>
+            <w:tcW w:type="dxa" w:w="2664"/>
             <w:tcBorders>
               <w:top w:color="000000" w:space="0" w:sz="0" w:val="nil"/>
               <w:left w:color="000000" w:space="0" w:sz="0" w:val="nil"/>
@@ -4070,7 +3912,7 @@
                 <w:szCs w:val="22"/>
                 <w:rtl w:val="0"/>
               </w:rPr>
-              <w:t xml:space="preserve">Pre-mortem exercise, scaled to a multi-agent/shared-memory scenario: which failure modes compound when more than one agent acts on shared state?</w:t>
+              <w:t>Shared-memory premortem</w:t>
             </w:r>
           </w:p>
         </w:tc>
@@ -4083,6 +3925,7 @@
         </w:trPr>
         <w:tc>
           <w:tcPr>
+            <w:tcW w:type="dxa" w:w="792"/>
             <w:tcBorders>
               <w:top w:color="000000" w:space="0" w:sz="0" w:val="nil"/>
               <w:left w:color="000000" w:space="0" w:sz="0" w:val="nil"/>
@@ -4113,12 +3956,13 @@
                 <w:szCs w:val="22"/>
                 <w:rtl w:val="0"/>
               </w:rPr>
-              <w:t xml:space="preserve">13</w:t>
+              <w:t>13</w:t>
             </w:r>
           </w:p>
         </w:tc>
         <w:tc>
           <w:tcPr>
+            <w:tcW w:type="dxa" w:w="2232"/>
             <w:tcBorders>
               <w:top w:color="000000" w:space="0" w:sz="0" w:val="nil"/>
               <w:left w:color="000000" w:space="0" w:sz="0" w:val="nil"/>
@@ -4149,12 +3993,13 @@
                 <w:szCs w:val="22"/>
                 <w:rtl w:val="0"/>
               </w:rPr>
-              <w:t xml:space="preserve">Module 5 + Book Ch.10</w:t>
+              <w:t>Evaluation and human approval gates</w:t>
             </w:r>
           </w:p>
         </w:tc>
         <w:tc>
           <w:tcPr>
+            <w:tcW w:type="dxa" w:w="3672"/>
             <w:tcBorders>
               <w:top w:color="000000" w:space="0" w:sz="0" w:val="nil"/>
               <w:left w:color="000000" w:space="0" w:sz="0" w:val="nil"/>
@@ -4187,41 +4032,13 @@
                 <w:szCs w:val="22"/>
                 <w:rtl w:val="0"/>
               </w:rPr>
-              <w:t xml:space="preserve">Theory:</w:t>
-            </w:r>
-            <w:r>
-              <w:rPr>
-                <w:rFonts w:ascii="Calibri" w:cs="Calibri" w:eastAsia="Calibri" w:hAnsi="Calibri"/>
-                <w:sz w:val="22"/>
-                <w:szCs w:val="22"/>
-                <w:rtl w:val="0"/>
-              </w:rPr>
-              <w:t xml:space="preserve"> Agent Evaluation and Benchmarking. </w:t>
-            </w:r>
-            <w:r>
-              <w:rPr>
-                <w:rFonts w:ascii="Calibri" w:cs="Calibri" w:eastAsia="Calibri" w:hAnsi="Calibri"/>
-                <w:b w:val="1"/>
-                <w:bCs w:val="1"/>
-                <w:sz w:val="22"/>
-                <w:szCs w:val="22"/>
-                <w:rtl w:val="0"/>
-              </w:rPr>
-              <w:t xml:space="preserve">In class:</w:t>
-            </w:r>
-            <w:r>
-              <w:rPr>
-                <w:rFonts w:ascii="Calibri" w:cs="Calibri" w:eastAsia="Calibri" w:hAnsi="Calibri"/>
-                <w:sz w:val="22"/>
-                <w:szCs w:val="22"/>
-                <w:rtl w:val="0"/>
-              </w:rPr>
-              <w:t xml:space="preserve"> Designing Human Approval Gates.</w:t>
+              <w:t>Proposal fingerprints, reviewable fields, bounded approvals</w:t>
             </w:r>
           </w:p>
         </w:tc>
         <w:tc>
           <w:tcPr>
+            <w:tcW w:type="dxa" w:w="2664"/>
             <w:tcBorders>
               <w:top w:color="000000" w:space="0" w:sz="0" w:val="nil"/>
               <w:left w:color="000000" w:space="0" w:sz="0" w:val="nil"/>
@@ -4252,7 +4069,7 @@
                 <w:szCs w:val="22"/>
                 <w:rtl w:val="0"/>
               </w:rPr>
-              <w:t xml:space="preserve">Redesign a real "Allow?" gate into a six-element gate; connect evaluation criteria to what a gate should check before approving.</w:t>
+              <w:t>Approval gate design</w:t>
             </w:r>
           </w:p>
         </w:tc>
@@ -4265,6 +4082,7 @@
         </w:trPr>
         <w:tc>
           <w:tcPr>
+            <w:tcW w:type="dxa" w:w="792"/>
             <w:tcBorders>
               <w:top w:color="000000" w:space="0" w:sz="0" w:val="nil"/>
               <w:left w:color="000000" w:space="0" w:sz="0" w:val="nil"/>
@@ -4295,12 +4113,13 @@
                 <w:szCs w:val="22"/>
                 <w:rtl w:val="0"/>
               </w:rPr>
-              <w:t xml:space="preserve">14</w:t>
+              <w:t>14</w:t>
             </w:r>
           </w:p>
         </w:tc>
         <w:tc>
           <w:tcPr>
+            <w:tcW w:type="dxa" w:w="2232"/>
             <w:tcBorders>
               <w:top w:color="000000" w:space="0" w:sz="0" w:val="nil"/>
               <w:left w:color="000000" w:space="0" w:sz="0" w:val="nil"/>
@@ -4331,12 +4150,13 @@
                 <w:szCs w:val="22"/>
                 <w:rtl w:val="0"/>
               </w:rPr>
-              <w:t xml:space="preserve">Module 5 + Book Ch.11</w:t>
+              <w:t>Team governance and applied ethics</w:t>
             </w:r>
           </w:p>
         </w:tc>
         <w:tc>
           <w:tcPr>
+            <w:tcW w:type="dxa" w:w="3672"/>
             <w:tcBorders>
               <w:top w:color="000000" w:space="0" w:sz="0" w:val="nil"/>
               <w:left w:color="000000" w:space="0" w:sz="0" w:val="nil"/>
@@ -4369,41 +4189,13 @@
                 <w:szCs w:val="22"/>
                 <w:rtl w:val="0"/>
               </w:rPr>
-              <w:t xml:space="preserve">Theory:</w:t>
-            </w:r>
-            <w:r>
-              <w:rPr>
-                <w:rFonts w:ascii="Calibri" w:cs="Calibri" w:eastAsia="Calibri" w:hAnsi="Calibri"/>
-                <w:sz w:val="22"/>
-                <w:szCs w:val="22"/>
-                <w:rtl w:val="0"/>
-              </w:rPr>
-              <w:t xml:space="preserve"> Ethical Considerations in Agentic AI — alignment, safety, societal implications. </w:t>
-            </w:r>
-            <w:r>
-              <w:rPr>
-                <w:rFonts w:ascii="Calibri" w:cs="Calibri" w:eastAsia="Calibri" w:hAnsi="Calibri"/>
-                <w:b w:val="1"/>
-                <w:bCs w:val="1"/>
-                <w:sz w:val="22"/>
-                <w:szCs w:val="22"/>
-                <w:rtl w:val="0"/>
-              </w:rPr>
-              <w:t xml:space="preserve">In class:</w:t>
-            </w:r>
-            <w:r>
-              <w:rPr>
-                <w:rFonts w:ascii="Calibri" w:cs="Calibri" w:eastAsia="Calibri" w:hAnsi="Calibri"/>
-                <w:sz w:val="22"/>
-                <w:szCs w:val="22"/>
-                <w:rtl w:val="0"/>
-              </w:rPr>
-              <w:t xml:space="preserve"> Agentic AI in Teams and Organizations.</w:t>
+              <w:t>Ownership, data boundaries, incident response, pause authority</w:t>
             </w:r>
           </w:p>
         </w:tc>
         <w:tc>
           <w:tcPr>
+            <w:tcW w:type="dxa" w:w="2664"/>
             <w:tcBorders>
               <w:top w:color="000000" w:space="0" w:sz="0" w:val="nil"/>
               <w:left w:color="000000" w:space="0" w:sz="0" w:val="nil"/>
@@ -4434,7 +4226,7 @@
                 <w:szCs w:val="22"/>
                 <w:rtl w:val="0"/>
               </w:rPr>
-              <w:t xml:space="preserve">Draft a team AI-use register entry; governance is applied ethics at the team level.</w:t>
+              <w:t>Team AI-use register</w:t>
             </w:r>
           </w:p>
         </w:tc>
@@ -4447,6 +4239,7 @@
         </w:trPr>
         <w:tc>
           <w:tcPr>
+            <w:tcW w:type="dxa" w:w="792"/>
             <w:tcBorders>
               <w:top w:color="000000" w:space="0" w:sz="0" w:val="nil"/>
               <w:left w:color="000000" w:space="0" w:sz="0" w:val="nil"/>
@@ -4477,12 +4270,13 @@
                 <w:szCs w:val="22"/>
                 <w:rtl w:val="0"/>
               </w:rPr>
-              <w:t xml:space="preserve">15</w:t>
+              <w:t>15</w:t>
             </w:r>
           </w:p>
         </w:tc>
         <w:tc>
           <w:tcPr>
+            <w:tcW w:type="dxa" w:w="2232"/>
             <w:tcBorders>
               <w:top w:color="000000" w:space="0" w:sz="0" w:val="nil"/>
               <w:left w:color="000000" w:space="0" w:sz="0" w:val="nil"/>
@@ -4513,12 +4307,13 @@
                 <w:szCs w:val="22"/>
                 <w:rtl w:val="0"/>
               </w:rPr>
-              <w:t xml:space="preserve">Book Ch.12</w:t>
+              <w:t>Supervised agentic capstone</w:t>
             </w:r>
           </w:p>
         </w:tc>
         <w:tc>
           <w:tcPr>
+            <w:tcW w:type="dxa" w:w="3672"/>
             <w:tcBorders>
               <w:top w:color="000000" w:space="0" w:sz="0" w:val="nil"/>
               <w:left w:color="000000" w:space="0" w:sz="0" w:val="nil"/>
@@ -4549,12 +4344,13 @@
                 <w:szCs w:val="22"/>
                 <w:rtl w:val="0"/>
               </w:rPr>
-              <w:t xml:space="preserve">Capstone — Supervised Agentic Project, run "in the wild."</w:t>
+              <w:t>Integrate mechanisms into one bounded evidence chain and handoff</w:t>
             </w:r>
           </w:p>
         </w:tc>
         <w:tc>
           <w:tcPr>
+            <w:tcW w:type="dxa" w:w="2664"/>
             <w:tcBorders>
               <w:top w:color="000000" w:space="0" w:sz="0" w:val="nil"/>
               <w:left w:color="000000" w:space="0" w:sz="0" w:val="nil"/>
@@ -4585,27 +4381,7 @@
                 <w:szCs w:val="22"/>
                 <w:rtl w:val="0"/>
               </w:rPr>
-              <w:t xml:space="preserve">Full ten-artifact packet: brief, data boundary, action surface map, plan, gates, pre-mortem, evidence, artifact, audit note, transfer reflection. </w:t>
-            </w:r>
-            <w:r>
-              <w:rPr>
-                <w:rFonts w:ascii="Calibri" w:cs="Calibri" w:eastAsia="Calibri" w:hAnsi="Calibri"/>
-                <w:b w:val="1"/>
-                <w:bCs w:val="1"/>
-                <w:sz w:val="22"/>
-                <w:szCs w:val="22"/>
-                <w:rtl w:val="0"/>
-              </w:rPr>
-              <w:t xml:space="preserve">Progress Reel:</w:t>
-            </w:r>
-            <w:r>
-              <w:rPr>
-                <w:rFonts w:ascii="Calibri" w:cs="Calibri" w:eastAsia="Calibri" w:hAnsi="Calibri"/>
-                <w:sz w:val="22"/>
-                <w:szCs w:val="22"/>
-                <w:rtl w:val="0"/>
-              </w:rPr>
-              <w:t xml:space="preserve"> final project video, played and discussed in class — no live presentation.</w:t>
+              <w:t>Capstone packet</w:t>
             </w:r>
           </w:p>
         </w:tc>
@@ -4641,8 +4417,6 @@
           <w:szCs w:val="34"/>
         </w:rPr>
       </w:pPr>
-      <w:bookmarkStart w:colFirst="0" w:colLast="0" w:name="_mvyvr32zczjo" w:id="8"/>
-      <w:bookmarkEnd w:id="8"/>
       <w:r>
         <w:rPr>
           <w:rFonts w:ascii="Calibri" w:cs="Calibri" w:eastAsia="Calibri" w:hAnsi="Calibri"/>
@@ -4650,7 +4424,7 @@
           <w:szCs w:val="34"/>
           <w:rtl w:val="0"/>
         </w:rPr>
-        <w:t xml:space="preserve">Course Materials</w:t>
+        <w:t>Course Materials</w:t>
       </w:r>
     </w:p>
     <w:p>
@@ -4664,8 +4438,6 @@
           <w:szCs w:val="26"/>
         </w:rPr>
       </w:pPr>
-      <w:bookmarkStart w:colFirst="0" w:colLast="0" w:name="_62a46asdocte" w:id="9"/>
-      <w:bookmarkEnd w:id="9"/>
       <w:r>
         <w:rPr>
           <w:rFonts w:ascii="Calibri" w:cs="Calibri" w:eastAsia="Calibri" w:hAnsi="Calibri"/>
@@ -4673,7 +4445,7 @@
           <w:szCs w:val="26"/>
           <w:rtl w:val="0"/>
         </w:rPr>
-        <w:t xml:space="preserve">Textbook</w:t>
+        <w:t>Required Course Book</w:t>
       </w:r>
     </w:p>
     <w:p>
@@ -4694,96 +4466,7 @@
           <w:szCs w:val="22"/>
           <w:rtl w:val="0"/>
         </w:rPr>
-        <w:t xml:space="preserve">Title:</w:t>
-      </w:r>
-      <w:r>
-        <w:rPr>
-          <w:rFonts w:ascii="Calibri" w:cs="Calibri" w:eastAsia="Calibri" w:hAnsi="Calibri"/>
-          <w:sz w:val="22"/>
-          <w:szCs w:val="22"/>
-          <w:rtl w:val="0"/>
-        </w:rPr>
-        <w:t xml:space="preserve"> </w:t>
-      </w:r>
-      <w:r>
-        <w:rPr>
-          <w:rFonts w:ascii="Calibri" w:cs="Calibri" w:eastAsia="Calibri" w:hAnsi="Calibri"/>
-          <w:i w:val="1"/>
-          <w:iCs w:val="1"/>
-          <w:sz w:val="22"/>
-          <w:szCs w:val="22"/>
-          <w:rtl w:val="0"/>
-        </w:rPr>
-        <w:t xml:space="preserve">Prompt Engineering for Generative AI</w:t>
-      </w:r>
-      <w:r>
-        <w:rPr>
-          <w:rFonts w:ascii="Calibri" w:cs="Calibri" w:eastAsia="Calibri" w:hAnsi="Calibri"/>
-          <w:sz w:val="22"/>
-          <w:szCs w:val="22"/>
-          <w:rtl w:val="0"/>
-        </w:rPr>
-        <w:t xml:space="preserve"> by Nik Bear Brown (Free Online) </w:t>
-      </w:r>
-      <w:r>
-        <w:rPr>
-          <w:rFonts w:ascii="Calibri" w:cs="Calibri" w:eastAsia="Calibri" w:hAnsi="Calibri"/>
-          <w:b w:val="1"/>
-          <w:bCs w:val="1"/>
-          <w:sz w:val="22"/>
-          <w:szCs w:val="22"/>
-          <w:rtl w:val="0"/>
-        </w:rPr>
-        <w:t xml:space="preserve">Publisher:</w:t>
-      </w:r>
-      <w:r>
-        <w:rPr>
-          <w:rFonts w:ascii="Calibri" w:cs="Calibri" w:eastAsia="Calibri" w:hAnsi="Calibri"/>
-          <w:sz w:val="22"/>
-          <w:szCs w:val="22"/>
-          <w:rtl w:val="0"/>
-        </w:rPr>
-        <w:t xml:space="preserve"> Abecedarian, LLC </w:t>
-      </w:r>
-      <w:r>
-        <w:rPr>
-          <w:rFonts w:ascii="Calibri" w:cs="Calibri" w:eastAsia="Calibri" w:hAnsi="Calibri"/>
-          <w:b w:val="1"/>
-          <w:bCs w:val="1"/>
-          <w:sz w:val="22"/>
-          <w:szCs w:val="22"/>
-          <w:rtl w:val="0"/>
-        </w:rPr>
-        <w:t xml:space="preserve">Publication Date:</w:t>
-      </w:r>
-      <w:r>
-        <w:rPr>
-          <w:rFonts w:ascii="Calibri" w:cs="Calibri" w:eastAsia="Calibri" w:hAnsi="Calibri"/>
-          <w:sz w:val="22"/>
-          <w:szCs w:val="22"/>
-          <w:rtl w:val="0"/>
-        </w:rPr>
-        <w:t xml:space="preserve"> January 2023 </w:t>
-      </w:r>
-      <w:r>
-        <w:rPr>
-          <w:rFonts w:ascii="Calibri" w:cs="Calibri" w:eastAsia="Calibri" w:hAnsi="Calibri"/>
-          <w:b w:val="1"/>
-          <w:bCs w:val="1"/>
-          <w:sz w:val="22"/>
-          <w:szCs w:val="22"/>
-          <w:rtl w:val="0"/>
-        </w:rPr>
-        <w:t xml:space="preserve">ISBN:</w:t>
-      </w:r>
-      <w:r>
-        <w:rPr>
-          <w:rFonts w:ascii="Calibri" w:cs="Calibri" w:eastAsia="Calibri" w:hAnsi="Calibri"/>
-          <w:sz w:val="22"/>
-          <w:szCs w:val="22"/>
-          <w:rtl w:val="0"/>
-        </w:rPr>
-        <w:t xml:space="preserve"> [ISBN]</w:t>
+        <w:t>Prompt Engineering for Generative AI by Nik Bear Brown. The 15-chapter book is available in the course GitHub repository, with one chapter mapped to each weekly lesson.</w:t>
       </w:r>
     </w:p>
     <w:p>
@@ -4802,7 +4485,7 @@
           <w:szCs w:val="22"/>
           <w:rtl w:val="0"/>
         </w:rPr>
-        <w:t xml:space="preserve">Covers Weeks 1–2 and Week 9, unchanged.</w:t>
+        <w:t>The chapters use a narrative teardown voice: begin with a working result, expose the mechanism, test the failure boundary, and assign the learner's own implementation and explanation.</w:t>
       </w:r>
     </w:p>
     <w:p>
@@ -4816,8 +4499,6 @@
           <w:szCs w:val="26"/>
         </w:rPr>
       </w:pPr>
-      <w:bookmarkStart w:colFirst="0" w:colLast="0" w:name="_9gdfiux9bifq" w:id="10"/>
-      <w:bookmarkEnd w:id="10"/>
       <w:r>
         <w:rPr>
           <w:rFonts w:ascii="Calibri" w:cs="Calibri" w:eastAsia="Calibri" w:hAnsi="Calibri"/>
@@ -4825,7 +4506,7 @@
           <w:szCs w:val="26"/>
           <w:rtl w:val="0"/>
         </w:rPr>
-        <w:t xml:space="preserve">Required — Claude Agentic AI</w:t>
+        <w:t>Required Software and Access</w:t>
       </w:r>
     </w:p>
     <w:p>
@@ -4844,27 +4525,7 @@
           <w:szCs w:val="22"/>
           <w:rtl w:val="0"/>
         </w:rPr>
-        <w:t xml:space="preserve">Brown, N.B. </w:t>
-      </w:r>
-      <w:r>
-        <w:rPr>
-          <w:rFonts w:ascii="Calibri" w:cs="Calibri" w:eastAsia="Calibri" w:hAnsi="Calibri"/>
-          <w:i w:val="1"/>
-          <w:iCs w:val="1"/>
-          <w:sz w:val="22"/>
-          <w:szCs w:val="22"/>
-          <w:rtl w:val="0"/>
-        </w:rPr>
-        <w:t xml:space="preserve">Claude Agentic AI.</w:t>
-      </w:r>
-      <w:r>
-        <w:rPr>
-          <w:rFonts w:ascii="Calibri" w:cs="Calibri" w:eastAsia="Calibri" w:hAnsi="Calibri"/>
-          <w:sz w:val="22"/>
-          <w:szCs w:val="22"/>
-          <w:rtl w:val="0"/>
-        </w:rPr>
-        <w:t xml:space="preserve"> Bear Brown LLC, 2026. Provided as epub and PDF. Covers Weeks 3–8 and 10–15 (in-class supervision practice).</w:t>
+        <w:t>Python 3.11 or newer, Git, GitHub, and Claude Code through Northeastern are required. Begin with https://claude.northeastern.edu/. The offline reference code requires no API key and no third-party Python package.</w:t>
       </w:r>
     </w:p>
     <w:p>
@@ -4878,8 +4539,6 @@
           <w:szCs w:val="26"/>
         </w:rPr>
       </w:pPr>
-      <w:bookmarkStart w:colFirst="0" w:colLast="0" w:name="_qnzjan9l658i" w:id="11"/>
-      <w:bookmarkEnd w:id="11"/>
       <w:r>
         <w:rPr>
           <w:rFonts w:ascii="Calibri" w:cs="Calibri" w:eastAsia="Calibri" w:hAnsi="Calibri"/>
@@ -4887,7 +4546,7 @@
           <w:szCs w:val="26"/>
           <w:rtl w:val="0"/>
         </w:rPr>
-        <w:t xml:space="preserve">Required — second book (Module 5 theory)</w:t>
+        <w:t>Required Technical Guidance</w:t>
       </w:r>
     </w:p>
     <w:p>
@@ -4908,18 +4567,7 @@
           <w:szCs w:val="22"/>
           <w:rtl w:val="0"/>
         </w:rPr>
-        <w:t xml:space="preserve">Covers Module 5's architecture/theory side (Foundations, Agent Architectures, Tool Use, Planning, Memory Systems, Multi-Agent Systems, Evaluation, Ethics), delivered as video theory. </w:t>
-      </w:r>
-      <w:r>
-        <w:rPr>
-          <w:rFonts w:ascii="Calibri" w:cs="Calibri" w:eastAsia="Calibri" w:hAnsi="Calibri"/>
-          <w:b w:val="1"/>
-          <w:bCs w:val="1"/>
-          <w:sz w:val="22"/>
-          <w:szCs w:val="22"/>
-          <w:rtl w:val="0"/>
-        </w:rPr>
-        <w:t xml:space="preserve">Title and citation still needed.</w:t>
+        <w:t>The repository links the relevant Anthropic documentation and other primary technical sources. Students should use the linked version appropriate to the lesson and verify behavior against the current interface.</w:t>
       </w:r>
     </w:p>
     <w:p>
@@ -4933,8 +4581,6 @@
           <w:szCs w:val="26"/>
         </w:rPr>
       </w:pPr>
-      <w:bookmarkStart w:colFirst="0" w:colLast="0" w:name="_2fay9ncahw37" w:id="12"/>
-      <w:bookmarkEnd w:id="12"/>
       <w:r>
         <w:rPr>
           <w:rFonts w:ascii="Calibri" w:cs="Calibri" w:eastAsia="Calibri" w:hAnsi="Calibri"/>
@@ -4942,7 +4588,7 @@
           <w:szCs w:val="26"/>
           <w:rtl w:val="0"/>
         </w:rPr>
-        <w:t xml:space="preserve">Additional Readings</w:t>
+        <w:t>Additional Readings</w:t>
       </w:r>
     </w:p>
     <w:p>
@@ -4961,7 +4607,7 @@
           <w:szCs w:val="22"/>
           <w:rtl w:val="0"/>
         </w:rPr>
-        <w:t xml:space="preserve">In addition to the textbooks, you will also engage with academic papers, AI research reports, and articles specifically related to prompt engineering, fine-tuning, and agentic AI supervision.</w:t>
+        <w:t>Selected readings from Computational Skepticism for AI, Conducting AI, and Irreducibly Human accompany lessons only where they sharpen the chapter's argument. Academic papers and technical reports may also be assigned in Canvas.</w:t>
       </w:r>
     </w:p>
     <w:p>
@@ -4980,7 +4626,7 @@
           <w:szCs w:val="22"/>
           <w:rtl w:val="0"/>
         </w:rPr>
-        <w:t xml:space="preserve">By the end of this course, you will not only be proficient in prompt engineering for Generative AI but also equipped with the skills to fine-tune LLMs and supervise agentic AI systems responsibly, enabling you to harness the power of AI-driven creativity and problem-solving across diverse domains.</w:t>
+        <w:t>Course materials distinguish provider documentation, executed course evidence, constructed examples, and instructor interpretation.</w:t>
       </w:r>
     </w:p>
     <w:p>
@@ -5013,8 +4659,6 @@
           <w:szCs w:val="34"/>
         </w:rPr>
       </w:pPr>
-      <w:bookmarkStart w:colFirst="0" w:colLast="0" w:name="_yt7j6hlh631j" w:id="13"/>
-      <w:bookmarkEnd w:id="13"/>
       <w:r>
         <w:rPr>
           <w:rFonts w:ascii="Calibri" w:cs="Calibri" w:eastAsia="Calibri" w:hAnsi="Calibri"/>
@@ -5022,7 +4666,7 @@
           <w:szCs w:val="34"/>
           <w:rtl w:val="0"/>
         </w:rPr>
-        <w:t xml:space="preserve">Course GitHub</w:t>
+        <w:t>Course GitHub</w:t>
       </w:r>
     </w:p>
     <w:p>
@@ -5043,36 +4687,7 @@
           <w:szCs w:val="22"/>
           <w:rtl w:val="0"/>
         </w:rPr>
-        <w:t xml:space="preserve">The course GitHub (for all lectures, assignments and projects):</w:t>
-      </w:r>
-      <w:hyperlink r:id="rId7">
-        <w:r>
-          <w:rPr>
-            <w:rFonts w:ascii="Calibri" w:cs="Calibri" w:eastAsia="Calibri" w:hAnsi="Calibri"/>
-            <w:sz w:val="22"/>
-            <w:szCs w:val="22"/>
-            <w:rtl w:val="0"/>
-          </w:rPr>
-          <w:t xml:space="preserve"> </w:t>
-        </w:r>
-      </w:hyperlink>
-      <w:hyperlink r:id="rId8">
-        <w:r>
-          <w:rPr>
-            <w:rFonts w:ascii="Calibri" w:cs="Calibri" w:eastAsia="Calibri" w:hAnsi="Calibri"/>
-            <w:color w:val="1155cc"/>
-            <w:sz w:val="22"/>
-            <w:szCs w:val="22"/>
-            <w:u w:val="single"/>
-            <w:rtl w:val="0"/>
-          </w:rPr>
-          <w:t xml:space="preserve">https://github.com/nikbearbrown</w:t>
-        </w:r>
-      </w:hyperlink>
-      <w:r>
-        <w:rPr>
-          <w:rtl w:val="0"/>
-        </w:rPr>
+        <w:t>The course repository contains the book, lessons, reference code, Assessments, tests, assignment guidance, and figures: https://github.com/nikbearbrown/info-7375-prompt-engineering-for-generative-ai</w:t>
       </w:r>
     </w:p>
     <w:p>
@@ -5085,8 +4700,6 @@
           <w:szCs w:val="34"/>
         </w:rPr>
       </w:pPr>
-      <w:bookmarkStart w:colFirst="0" w:colLast="0" w:name="_xwisc2dx6gro" w:id="14"/>
-      <w:bookmarkEnd w:id="14"/>
       <w:r>
         <w:rPr>
           <w:rFonts w:ascii="Calibri" w:cs="Calibri" w:eastAsia="Calibri" w:hAnsi="Calibri"/>
@@ -5094,7 +4707,7 @@
           <w:szCs w:val="34"/>
           <w:rtl w:val="0"/>
         </w:rPr>
-        <w:t xml:space="preserve">nikbearbrown YouTube Channel</w:t>
+        <w:t>Instructor YouTube Channel</w:t>
       </w:r>
     </w:p>
     <w:p>
@@ -5115,36 +4728,7 @@
           <w:szCs w:val="22"/>
           <w:rtl w:val="0"/>
         </w:rPr>
-        <w:t xml:space="preserve">Over the course of the semester, additional data science and machine learning related videos will be posted on the instructor's YouTube channel:</w:t>
-      </w:r>
-      <w:hyperlink r:id="rId9">
-        <w:r>
-          <w:rPr>
-            <w:rFonts w:ascii="Calibri" w:cs="Calibri" w:eastAsia="Calibri" w:hAnsi="Calibri"/>
-            <w:sz w:val="22"/>
-            <w:szCs w:val="22"/>
-            <w:rtl w:val="0"/>
-          </w:rPr>
-          <w:t xml:space="preserve"> </w:t>
-        </w:r>
-      </w:hyperlink>
-      <w:hyperlink r:id="rId10">
-        <w:r>
-          <w:rPr>
-            <w:rFonts w:ascii="Calibri" w:cs="Calibri" w:eastAsia="Calibri" w:hAnsi="Calibri"/>
-            <w:color w:val="1155cc"/>
-            <w:sz w:val="22"/>
-            <w:szCs w:val="22"/>
-            <w:u w:val="single"/>
-            <w:rtl w:val="0"/>
-          </w:rPr>
-          <w:t xml:space="preserve">https://www.youtube.com/user/nikbearbrown</w:t>
-        </w:r>
-      </w:hyperlink>
-      <w:r>
-        <w:rPr>
-          <w:rtl w:val="0"/>
-        </w:rPr>
+        <w:t>Assigned and supplemental course videos are published through the instructor's channel: https://www.youtube.com/user/nikbearbrown</w:t>
       </w:r>
     </w:p>
     <w:p>
@@ -5163,7 +4747,7 @@
           <w:szCs w:val="22"/>
           <w:rtl w:val="0"/>
         </w:rPr>
-        <w:t xml:space="preserve">The purpose of these videos is to provide additional advanced content as well as supplemental coverage of course material. Suggestions for video topics are always welcome.</w:t>
+        <w:t>Video availability and lesson-specific links are announced in Canvas. A course film's source files may also appear in the repository's youtube folder.</w:t>
       </w:r>
     </w:p>
     <w:p>
@@ -5176,8 +4760,6 @@
           <w:szCs w:val="34"/>
         </w:rPr>
       </w:pPr>
-      <w:bookmarkStart w:colFirst="0" w:colLast="0" w:name="_9my2i24rjcd4" w:id="15"/>
-      <w:bookmarkEnd w:id="15"/>
       <w:r>
         <w:rPr>
           <w:rFonts w:ascii="Calibri" w:cs="Calibri" w:eastAsia="Calibri" w:hAnsi="Calibri"/>
@@ -5185,7 +4767,7 @@
           <w:szCs w:val="34"/>
           <w:rtl w:val="0"/>
         </w:rPr>
-        <w:t xml:space="preserve">YouTube Course Content</w:t>
+        <w:t>Optional Assignment Explainers</w:t>
       </w:r>
     </w:p>
     <w:p>
@@ -5206,36 +4788,7 @@
           <w:szCs w:val="22"/>
           <w:rtl w:val="0"/>
         </w:rPr>
-        <w:t xml:space="preserve">Over the course of the semester, all lectures — including the Module 2, Module 3, and Module 5 theory content described above — will be broken into 5–15 minute lessons and posted on the nikbearbrown YouTube channel:</w:t>
-      </w:r>
-      <w:hyperlink r:id="rId11">
-        <w:r>
-          <w:rPr>
-            <w:rFonts w:ascii="Calibri" w:cs="Calibri" w:eastAsia="Calibri" w:hAnsi="Calibri"/>
-            <w:sz w:val="22"/>
-            <w:szCs w:val="22"/>
-            <w:rtl w:val="0"/>
-          </w:rPr>
-          <w:t xml:space="preserve"> </w:t>
-        </w:r>
-      </w:hyperlink>
-      <w:hyperlink r:id="rId12">
-        <w:r>
-          <w:rPr>
-            <w:rFonts w:ascii="Calibri" w:cs="Calibri" w:eastAsia="Calibri" w:hAnsi="Calibri"/>
-            <w:color w:val="1155cc"/>
-            <w:sz w:val="22"/>
-            <w:szCs w:val="22"/>
-            <w:u w:val="single"/>
-            <w:rtl w:val="0"/>
-          </w:rPr>
-          <w:t xml:space="preserve">https://www.youtube.com/user/nikbearbrown</w:t>
-        </w:r>
-      </w:hyperlink>
-      <w:r>
-        <w:rPr>
-          <w:rtl w:val="0"/>
-        </w:rPr>
+        <w:t>An explainer video is optional. It has no separate point category and is not required for full credit. A clear video may strengthen professional communication considered within Relative Quartile; visual polish cannot replace correct implementation, evidence, or understanding.</w:t>
       </w:r>
     </w:p>
     <w:p>
@@ -5254,7 +4807,7 @@
           <w:szCs w:val="22"/>
           <w:rtl w:val="0"/>
         </w:rPr>
-        <w:t xml:space="preserve">These bite-sized video lessons allow you to:</w:t>
+        <w:t>Brutalist is one optional workflow for producing an explainer.</w:t>
       </w:r>
     </w:p>
     <w:p>
@@ -5278,7 +4831,7 @@
           <w:szCs w:val="22"/>
           <w:rtl w:val="0"/>
         </w:rPr>
-        <w:t xml:space="preserve">Review lectures at your own pace</w:t>
+        <w:t>Students may use another recording or presentation workflow.</w:t>
       </w:r>
     </w:p>
     <w:p>
@@ -5302,7 +4855,7 @@
           <w:szCs w:val="22"/>
           <w:rtl w:val="0"/>
         </w:rPr>
-        <w:t xml:space="preserve">Focus on specific topics you need to revisit</w:t>
+        <w:t>Using Brutalist earns no automatic bonus.</w:t>
       </w:r>
     </w:p>
     <w:p>
@@ -5326,7 +4879,7 @@
           <w:szCs w:val="22"/>
           <w:rtl w:val="0"/>
         </w:rPr>
-        <w:t xml:space="preserve">Access course content anytime, anywhere</w:t>
+        <w:t>Not using Brutalist incurs no automatic penalty.</w:t>
       </w:r>
     </w:p>
     <w:p>
@@ -5350,7 +4903,7 @@
           <w:szCs w:val="22"/>
           <w:rtl w:val="0"/>
         </w:rPr>
-        <w:t xml:space="preserve">Pause and replay complex concepts as needed</w:t>
+        <w:t>No paid media account or public YouTube upload is required.</w:t>
       </w:r>
     </w:p>
     <w:p>
@@ -5369,7 +4922,7 @@
           <w:szCs w:val="22"/>
           <w:rtl w:val="0"/>
         </w:rPr>
-        <w:t xml:space="preserve">In addition to the core lecture content, supplemental videos will cover advanced topics, additional examples, and in-depth explorations of course material. Suggestions for topics are always welcome.</w:t>
+        <w:t>The prerequisite guide in the course repository explains the optional workflow and the quality expectations.</w:t>
       </w:r>
     </w:p>
     <w:p>
@@ -5423,8 +4976,6 @@
           <w:szCs w:val="34"/>
         </w:rPr>
       </w:pPr>
-      <w:bookmarkStart w:colFirst="0" w:colLast="0" w:name="_hcdk90oe5z5s" w:id="17"/>
-      <w:bookmarkEnd w:id="17"/>
       <w:r>
         <w:rPr>
           <w:rFonts w:ascii="Calibri" w:cs="Calibri" w:eastAsia="Calibri" w:hAnsi="Calibri"/>
@@ -5432,7 +4983,7 @@
           <w:szCs w:val="34"/>
           <w:rtl w:val="0"/>
         </w:rPr>
-        <w:t xml:space="preserve">Learning Assessment</w:t>
+        <w:t>Learning Assessment</w:t>
       </w:r>
     </w:p>
     <w:p>
@@ -5451,7 +5002,7 @@
           <w:szCs w:val="22"/>
           <w:rtl w:val="0"/>
         </w:rPr>
-        <w:t xml:space="preserve">Achievement of learning outcomes will be assessed and graded through:</w:t>
+        <w:t>Lesson exercises, builds, practice labs, knowledge checks, and quizzes are ungraded Assessments. They provide feedback and prepare students for graded work.</w:t>
       </w:r>
     </w:p>
     <w:p>
@@ -5475,7 +5026,7 @@
           <w:szCs w:val="22"/>
           <w:rtl w:val="0"/>
         </w:rPr>
-        <w:t xml:space="preserve">Quizzes</w:t>
+        <w:t>Graded Assignments are due every 10 days and worth 100 points each.</w:t>
       </w:r>
     </w:p>
     <w:p>
@@ -5499,7 +5050,7 @@
           <w:szCs w:val="22"/>
           <w:rtl w:val="0"/>
         </w:rPr>
-        <w:t xml:space="preserve">Completion of assignments</w:t>
+        <w:t>Each Assignment identifies the Assessments to implement and requires reproducible Python code, meaningful tests, results, and an explanation of the mechanism.</w:t>
       </w:r>
     </w:p>
     <w:p>
@@ -5523,7 +5074,7 @@
           <w:szCs w:val="22"/>
           <w:rtl w:val="0"/>
         </w:rPr>
-        <w:t xml:space="preserve">Completion of term projects</w:t>
+        <w:t>Students submit matching versions to Canvas and GitHub and must be able to explain every submitted component, including AI-assisted work.</w:t>
       </w:r>
     </w:p>
     <w:p>
@@ -5547,7 +5098,7 @@
           <w:szCs w:val="22"/>
           <w:rtl w:val="0"/>
         </w:rPr>
-        <w:t xml:space="preserve">Progress Reels (Week 8 and Week 15) — graded as part of participation/assignments, per the Course Schedule above</w:t>
+        <w:t>Optional videos, including Progress Reel-style explanations, may support comparative professional quality but are not independent graded requirements.</w:t>
       </w:r>
     </w:p>
     <w:p>
@@ -5621,8 +5172,6 @@
           <w:szCs w:val="34"/>
         </w:rPr>
       </w:pPr>
-      <w:bookmarkStart w:colFirst="0" w:colLast="0" w:name="_1zazhe7qe0px" w:id="19"/>
-      <w:bookmarkEnd w:id="19"/>
       <w:r>
         <w:rPr>
           <w:rFonts w:ascii="Calibri" w:cs="Calibri" w:eastAsia="Calibri" w:hAnsi="Calibri"/>
@@ -5630,7 +5179,7 @@
           <w:szCs w:val="34"/>
           <w:rtl w:val="0"/>
         </w:rPr>
-        <w:t xml:space="preserve">Grading Policies</w:t>
+        <w:t>Grading Policies</w:t>
       </w:r>
     </w:p>
     <w:p>
@@ -5649,7 +5198,7 @@
           <w:szCs w:val="22"/>
           <w:rtl w:val="0"/>
         </w:rPr>
-        <w:t xml:space="preserve">A point system is used for grading. Every assignment, project, and exam you are expected to complete is assigned a point value, ranging from 1 to 1000 points.</w:t>
+        <w:t>Each graded Assignment is worth 100 points. Canvas publishes the deadline, covered Assessments, implementation requirements, and any assignment-specific constraints.</w:t>
       </w:r>
     </w:p>
     <w:p>
@@ -5673,7 +5222,7 @@
           <w:szCs w:val="22"/>
           <w:rtl w:val="0"/>
         </w:rPr>
-        <w:t xml:space="preserve">Late submissions incur a 10% deduction per day, rounded up.</w:t>
+        <w:t>Late submissions follow the Due Dates and Late Work Policy below.</w:t>
       </w:r>
     </w:p>
     <w:p>
@@ -5711,8 +5260,6 @@
           <w:szCs w:val="26"/>
         </w:rPr>
       </w:pPr>
-      <w:bookmarkStart w:colFirst="0" w:colLast="0" w:name="_r2vsgguam29w" w:id="20"/>
-      <w:bookmarkEnd w:id="20"/>
       <w:r>
         <w:rPr>
           <w:rFonts w:ascii="Calibri" w:cs="Calibri" w:eastAsia="Calibri" w:hAnsi="Calibri"/>
@@ -5720,7 +5267,7 @@
           <w:szCs w:val="26"/>
           <w:rtl w:val="0"/>
         </w:rPr>
-        <w:t xml:space="preserve">AI Based Grading Approach</w:t>
+        <w:t>Assignment Rubric</w:t>
       </w:r>
     </w:p>
     <w:p>
@@ -5739,7 +5286,7 @@
           <w:szCs w:val="22"/>
           <w:rtl w:val="0"/>
         </w:rPr>
-        <w:t xml:space="preserve">Due to the widespread use of Generative AI, grading is adjusted as follows:</w:t>
+        <w:t>Every graded Assignment uses the following common structure:</w:t>
       </w:r>
     </w:p>
     <w:p>
@@ -5758,7 +5305,7 @@
           <w:szCs w:val="22"/>
           <w:rtl w:val="0"/>
         </w:rPr>
-        <w:t xml:space="preserve">Students scoring 80% or higher (absolute scale) will be graded relatively based on class performance:</w:t>
+        <w:t>Implementation of the specified Assessments: 60 points.</w:t>
       </w:r>
     </w:p>
     <w:p>
@@ -5782,7 +5329,7 @@
           <w:szCs w:val="22"/>
           <w:rtl w:val="0"/>
         </w:rPr>
-        <w:t xml:space="preserve">Top 25% (rounded to the nearest integer): A</w:t>
+        <w:t>Frictional, an honest effort and learning log: 10 points.</w:t>
       </w:r>
     </w:p>
     <w:p>
@@ -5806,7 +5353,7 @@
           <w:szCs w:val="22"/>
           <w:rtl w:val="0"/>
         </w:rPr>
-        <w:t xml:space="preserve">Next 25%: A-</w:t>
+        <w:t>Proper GitHub version posting that matches Canvas: 10 points.</w:t>
       </w:r>
     </w:p>
     <w:p>
@@ -5830,7 +5377,7 @@
           <w:szCs w:val="22"/>
           <w:rtl w:val="0"/>
         </w:rPr>
-        <w:t xml:space="preserve">Next 25%: B+</w:t>
+        <w:t>Relative Quartile, assigned after the comparison group is reviewed: 20 points.</w:t>
       </w:r>
     </w:p>
     <w:p>
@@ -5854,7 +5401,7 @@
           <w:szCs w:val="22"/>
           <w:rtl w:val="0"/>
         </w:rPr>
-        <w:t xml:space="preserve">Final 25%: B</w:t>
+        <w:t>Total: 100 points.</w:t>
       </w:r>
     </w:p>
     <w:p>
@@ -5873,13 +5420,13 @@
           <w:szCs w:val="22"/>
           <w:rtl w:val="0"/>
         </w:rPr>
-        <w:t xml:space="preserve">Students scoring below 80% (absolute scale) will be graded based on the traditional absolute grading scale below:</w:t>
+        <w:t>Automated tests and quiz answers provide feedback; they are not grades by themselves.</w:t>
       </w:r>
     </w:p>
     <w:tbl>
       <w:tblPr>
         <w:tblStyle w:val="Table2"/>
-        <w:tblW w:w="2050.0" w:type="dxa"/>
+        <w:tblW w:w="9360" w:type="dxa"/>
         <w:jc w:val="left"/>
         <w:tblBorders>
           <w:top w:color="000000" w:space="0" w:sz="0" w:val="nil"/>
@@ -5893,14 +5440,8 @@
         <w:tblLook w:val="0600"/>
       </w:tblPr>
       <w:tblGrid>
-        <w:gridCol w:w="1160"/>
-        <w:gridCol w:w="890"/>
-        <w:tblGridChange w:id="0">
-          <w:tblGrid>
-            <w:gridCol w:w="1160"/>
-            <w:gridCol w:w="890"/>
-          </w:tblGrid>
-        </w:tblGridChange>
+        <w:gridCol w:w="7704"/>
+        <w:gridCol w:w="1656"/>
       </w:tblGrid>
       <w:tr>
         <w:trPr>
@@ -5910,6 +5451,7 @@
         </w:trPr>
         <w:tc>
           <w:tcPr>
+            <w:tcW w:type="dxa" w:w="7704"/>
             <w:tcBorders>
               <w:top w:color="000000" w:space="0" w:sz="0" w:val="nil"/>
               <w:left w:color="000000" w:space="0" w:sz="0" w:val="nil"/>
@@ -5943,17 +5485,13 @@
                 <w:szCs w:val="22"/>
                 <w:rtl w:val="0"/>
               </w:rPr>
-              <w:t xml:space="preserve">Score</w:t>
-            </w:r>
-            <w:r>
-              <w:rPr>
-                <w:rtl w:val="0"/>
-              </w:rPr>
+              <w:t>Component</w:t>
             </w:r>
           </w:p>
         </w:tc>
         <w:tc>
           <w:tcPr>
+            <w:tcW w:type="dxa" w:w="1656"/>
             <w:tcBorders>
               <w:top w:color="000000" w:space="0" w:sz="0" w:val="nil"/>
               <w:left w:color="000000" w:space="0" w:sz="0" w:val="nil"/>
@@ -5987,12 +5525,7 @@
                 <w:szCs w:val="22"/>
                 <w:rtl w:val="0"/>
               </w:rPr>
-              <w:t xml:space="preserve">Grade</w:t>
-            </w:r>
-            <w:r>
-              <w:rPr>
-                <w:rtl w:val="0"/>
-              </w:rPr>
+              <w:t>Points</w:t>
             </w:r>
           </w:p>
         </w:tc>
@@ -6005,6 +5538,7 @@
         </w:trPr>
         <w:tc>
           <w:tcPr>
+            <w:tcW w:type="dxa" w:w="7704"/>
             <w:tcBorders>
               <w:top w:color="000000" w:space="0" w:sz="0" w:val="nil"/>
               <w:left w:color="000000" w:space="0" w:sz="0" w:val="nil"/>
@@ -6035,12 +5569,13 @@
                 <w:szCs w:val="22"/>
                 <w:rtl w:val="0"/>
               </w:rPr>
-              <w:t xml:space="preserve">78–79</w:t>
+              <w:t>Implementation</w:t>
             </w:r>
           </w:p>
         </w:tc>
         <w:tc>
           <w:tcPr>
+            <w:tcW w:type="dxa" w:w="1656"/>
             <w:tcBorders>
               <w:top w:color="000000" w:space="0" w:sz="0" w:val="nil"/>
               <w:left w:color="000000" w:space="0" w:sz="0" w:val="nil"/>
@@ -6071,7 +5606,7 @@
                 <w:szCs w:val="22"/>
                 <w:rtl w:val="0"/>
               </w:rPr>
-              <w:t xml:space="preserve">C+</w:t>
+              <w:t>60</w:t>
             </w:r>
           </w:p>
         </w:tc>
@@ -6084,6 +5619,7 @@
         </w:trPr>
         <w:tc>
           <w:tcPr>
+            <w:tcW w:type="dxa" w:w="7704"/>
             <w:tcBorders>
               <w:top w:color="000000" w:space="0" w:sz="0" w:val="nil"/>
               <w:left w:color="000000" w:space="0" w:sz="0" w:val="nil"/>
@@ -6114,12 +5650,13 @@
                 <w:szCs w:val="22"/>
                 <w:rtl w:val="0"/>
               </w:rPr>
-              <w:t xml:space="preserve">73–77</w:t>
+              <w:t>Frictional</w:t>
             </w:r>
           </w:p>
         </w:tc>
         <w:tc>
           <w:tcPr>
+            <w:tcW w:type="dxa" w:w="1656"/>
             <w:tcBorders>
               <w:top w:color="000000" w:space="0" w:sz="0" w:val="nil"/>
               <w:left w:color="000000" w:space="0" w:sz="0" w:val="nil"/>
@@ -6150,7 +5687,7 @@
                 <w:szCs w:val="22"/>
                 <w:rtl w:val="0"/>
               </w:rPr>
-              <w:t xml:space="preserve">C</w:t>
+              <w:t>10</w:t>
             </w:r>
           </w:p>
         </w:tc>
@@ -6163,6 +5700,7 @@
         </w:trPr>
         <w:tc>
           <w:tcPr>
+            <w:tcW w:type="dxa" w:w="7704"/>
             <w:tcBorders>
               <w:top w:color="000000" w:space="0" w:sz="0" w:val="nil"/>
               <w:left w:color="000000" w:space="0" w:sz="0" w:val="nil"/>
@@ -6193,12 +5731,13 @@
                 <w:szCs w:val="22"/>
                 <w:rtl w:val="0"/>
               </w:rPr>
-              <w:t xml:space="preserve">70–72</w:t>
+              <w:t>GitHub version posting</w:t>
             </w:r>
           </w:p>
         </w:tc>
         <w:tc>
           <w:tcPr>
+            <w:tcW w:type="dxa" w:w="1656"/>
             <w:tcBorders>
               <w:top w:color="000000" w:space="0" w:sz="0" w:val="nil"/>
               <w:left w:color="000000" w:space="0" w:sz="0" w:val="nil"/>
@@ -6229,7 +5768,7 @@
                 <w:szCs w:val="22"/>
                 <w:rtl w:val="0"/>
               </w:rPr>
-              <w:t xml:space="preserve">C-</w:t>
+              <w:t>10</w:t>
             </w:r>
           </w:p>
         </w:tc>
@@ -6242,6 +5781,7 @@
         </w:trPr>
         <w:tc>
           <w:tcPr>
+            <w:tcW w:type="dxa" w:w="7704"/>
             <w:tcBorders>
               <w:top w:color="000000" w:space="0" w:sz="0" w:val="nil"/>
               <w:left w:color="000000" w:space="0" w:sz="0" w:val="nil"/>
@@ -6272,12 +5812,13 @@
                 <w:szCs w:val="22"/>
                 <w:rtl w:val="0"/>
               </w:rPr>
-              <w:t xml:space="preserve">60–69</w:t>
+              <w:t>Relative Quartile</w:t>
             </w:r>
           </w:p>
         </w:tc>
         <w:tc>
           <w:tcPr>
+            <w:tcW w:type="dxa" w:w="1656"/>
             <w:tcBorders>
               <w:top w:color="000000" w:space="0" w:sz="0" w:val="nil"/>
               <w:left w:color="000000" w:space="0" w:sz="0" w:val="nil"/>
@@ -6308,7 +5849,7 @@
                 <w:szCs w:val="22"/>
                 <w:rtl w:val="0"/>
               </w:rPr>
-              <w:t xml:space="preserve">D</w:t>
+              <w:t>20</w:t>
             </w:r>
           </w:p>
         </w:tc>
@@ -6321,6 +5862,7 @@
         </w:trPr>
         <w:tc>
           <w:tcPr>
+            <w:tcW w:type="dxa" w:w="7704"/>
             <w:tcBorders>
               <w:top w:color="000000" w:space="0" w:sz="0" w:val="nil"/>
               <w:left w:color="000000" w:space="0" w:sz="0" w:val="nil"/>
@@ -6351,12 +5893,13 @@
                 <w:szCs w:val="22"/>
                 <w:rtl w:val="0"/>
               </w:rPr>
-              <w:t xml:space="preserve">Below 60</w:t>
+              <w:t>Total</w:t>
             </w:r>
           </w:p>
         </w:tc>
         <w:tc>
           <w:tcPr>
+            <w:tcW w:type="dxa" w:w="1656"/>
             <w:tcBorders>
               <w:top w:color="000000" w:space="0" w:sz="0" w:val="nil"/>
               <w:left w:color="000000" w:space="0" w:sz="0" w:val="nil"/>
@@ -6387,7 +5930,7 @@
                 <w:szCs w:val="22"/>
                 <w:rtl w:val="0"/>
               </w:rPr>
-              <w:t xml:space="preserve">F</w:t>
+              <w:t>100</w:t>
             </w:r>
           </w:p>
         </w:tc>
@@ -6411,16 +5954,7 @@
           <w:szCs w:val="22"/>
           <w:rtl w:val="0"/>
         </w:rPr>
-        <w:t xml:space="preserve">Important:</w:t>
-      </w:r>
-      <w:r>
-        <w:rPr>
-          <w:rFonts w:ascii="Calibri" w:cs="Calibri" w:eastAsia="Calibri" w:hAnsi="Calibri"/>
-          <w:sz w:val="22"/>
-          <w:szCs w:val="22"/>
-          <w:rtl w:val="0"/>
-        </w:rPr>
-        <w:t xml:space="preserve"> Students below 80% cannot earn a grade higher than B-, even if the relative curve would otherwise place them higher.</w:t>
+        <w:t>There is no separate video score. A submission without a video can earn full credit.</w:t>
       </w:r>
     </w:p>
     <w:p>
@@ -6443,7 +5977,7 @@
           <w:szCs w:val="22"/>
           <w:rtl w:val="0"/>
         </w:rPr>
-        <w:t xml:space="preserve">Notes:</w:t>
+        <w:t>Relative Quartile</w:t>
       </w:r>
     </w:p>
     <w:p>
@@ -6467,7 +6001,7 @@
           <w:szCs w:val="22"/>
           <w:rtl w:val="0"/>
         </w:rPr>
-        <w:t xml:space="preserve">The instructor reserves the right to make minor adjustments for fairness.</w:t>
+        <w:t>The 20-point Relative Quartile component compares specificity, substantive improvement, demonstrated understanding, evidence, honesty about verification, usability, and professional communication across submissions for the same Assignment.</w:t>
       </w:r>
     </w:p>
     <w:p>
@@ -6491,7 +6025,7 @@
           <w:szCs w:val="22"/>
           <w:rtl w:val="0"/>
         </w:rPr>
-        <w:t xml:space="preserve">Students are encouraged to complete all work independently and ethically, especially in light of Generative AI use.</w:t>
+        <w:t>Meeting the stated requirements can earn the 80 criterion-based points; it does not guarantee the comparative 20 points. The instructor and TAs review the complete comparison group before assigning this component.</w:t>
       </w:r>
     </w:p>
     <w:p>
@@ -6505,8 +6039,6 @@
           <w:szCs w:val="26"/>
         </w:rPr>
       </w:pPr>
-      <w:bookmarkStart w:colFirst="0" w:colLast="0" w:name="_3z6nzbli47g7" w:id="21"/>
-      <w:bookmarkEnd w:id="21"/>
       <w:r>
         <w:rPr>
           <w:rFonts w:ascii="Calibri" w:cs="Calibri" w:eastAsia="Calibri" w:hAnsi="Calibri"/>
@@ -6514,7 +6046,7 @@
           <w:szCs w:val="26"/>
           <w:rtl w:val="0"/>
         </w:rPr>
-        <w:t xml:space="preserve">Canvas Submission Requirements</w:t>
+        <w:t>Canvas and GitHub Submission Requirements</w:t>
       </w:r>
     </w:p>
     <w:p>
@@ -6533,7 +6065,7 @@
           <w:szCs w:val="22"/>
           <w:rtl w:val="0"/>
         </w:rPr>
-        <w:t xml:space="preserve">You will submit your assignments via Canvas. Click the title of assignment (Canvas → assignment → Assignment Title) to go to the submission page.</w:t>
+        <w:t>Submit each Assignment through Canvas and post the matching reviewed version to GitHub. Include the GitHub folder link and final commit hash with the Canvas submission.</w:t>
       </w:r>
     </w:p>
     <w:p>
@@ -6556,7 +6088,7 @@
           <w:szCs w:val="22"/>
           <w:rtl w:val="0"/>
         </w:rPr>
-        <w:t xml:space="preserve">Submission Guidelines:</w:t>
+        <w:t>Submission Guidelines</w:t>
       </w:r>
     </w:p>
     <w:p>
@@ -6580,17 +6112,7 @@
           <w:szCs w:val="22"/>
           <w:rtl w:val="0"/>
         </w:rPr>
-        <w:t xml:space="preserve">Your name MUST be part of your submission: </w:t>
-      </w:r>
-      <w:r>
-        <w:rPr>
-          <w:rFonts w:ascii="Roboto Mono" w:cs="Roboto Mono" w:eastAsia="Roboto Mono" w:hAnsi="Roboto Mono"/>
-          <w:color w:val="188038"/>
-          <w:sz w:val="22"/>
-          <w:szCs w:val="22"/>
-          <w:rtl w:val="0"/>
-        </w:rPr>
-        <w:t xml:space="preserve">LastName_FirstName_Assignment_#.zip</w:t>
+        <w:t>Use the required Canvas filename: LastName_FirstName_INFO7375_Assignment_#.zip.</w:t>
       </w:r>
     </w:p>
     <w:p>
@@ -6614,7 +6136,7 @@
           <w:szCs w:val="22"/>
           <w:rtl w:val="0"/>
         </w:rPr>
-        <w:t xml:space="preserve">Multiple files must be zipped. No .RAR, .bz, .7z or other extensions.</w:t>
+        <w:t>Place the GitHub version under fall-2025/first-name-last-initial/assignment-XX/ unless Canvas specifies a different term folder.</w:t>
       </w:r>
     </w:p>
     <w:p>
@@ -6638,7 +6160,7 @@
           <w:szCs w:val="22"/>
           <w:rtl w:val="0"/>
         </w:rPr>
-        <w:t xml:space="preserve">Assignment file names MUST start with student's last name then first name (or group name) and include the class number and assignment number.</w:t>
+        <w:t>Include README.md, FRICTIONAL.md, the implementation, tests, and required evidence. Omit caches, unrelated files, credentials, restricted data, and private conversations.</w:t>
       </w:r>
     </w:p>
     <w:p>
@@ -6662,7 +6184,7 @@
           <w:szCs w:val="22"/>
           <w:rtl w:val="0"/>
         </w:rPr>
-        <w:t xml:space="preserve">Assignments MUST estimate the percentage of code written by the student versus external sources.</w:t>
+        <w:t>Identify what you contributed and what Claude or another person contributed. Credit starter repositories, examples, collaborators, and external sources. An artificial percentage estimate is not required.</w:t>
       </w:r>
     </w:p>
     <w:p>
@@ -6686,7 +6208,7 @@
           <w:szCs w:val="22"/>
           <w:rtl w:val="0"/>
         </w:rPr>
-        <w:t xml:space="preserve">Assignments MUST specify a license at the bottom of each notebook turned in.</w:t>
+        <w:t>The README must identify the Assignment and student, list contents, and provide setup, run, and test commands.</w:t>
       </w:r>
     </w:p>
     <w:p>
@@ -6710,7 +6232,7 @@
           <w:szCs w:val="22"/>
           <w:rtl w:val="0"/>
         </w:rPr>
-        <w:t xml:space="preserve">All code must adhere to a style guide and state which guide was used.</w:t>
+        <w:t>Use Python and PEP 8. State an appropriate license and ensure the GitHub version is accessible to the instructor and TAs.</w:t>
       </w:r>
     </w:p>
     <w:p>
@@ -6974,8 +6496,6 @@
           <w:szCs w:val="26"/>
         </w:rPr>
       </w:pPr>
-      <w:bookmarkStart w:colFirst="0" w:colLast="0" w:name="_hvyhdfu4qf2i" w:id="23"/>
-      <w:bookmarkEnd w:id="23"/>
       <w:r>
         <w:rPr>
           <w:rFonts w:ascii="Calibri" w:cs="Calibri" w:eastAsia="Calibri" w:hAnsi="Calibri"/>
@@ -6983,7 +6503,7 @@
           <w:szCs w:val="26"/>
           <w:rtl w:val="0"/>
         </w:rPr>
-        <w:t xml:space="preserve">AI Policy for Coursework</w:t>
+        <w:t>AI Policy for Coursework</w:t>
       </w:r>
     </w:p>
     <w:p>
@@ -7004,16 +6524,7 @@
           <w:szCs w:val="22"/>
           <w:rtl w:val="0"/>
         </w:rPr>
-        <w:t xml:space="preserve">Use of AI in Assignments</w:t>
-      </w:r>
-      <w:r>
-        <w:rPr>
-          <w:rFonts w:ascii="Calibri" w:cs="Calibri" w:eastAsia="Calibri" w:hAnsi="Calibri"/>
-          <w:sz w:val="22"/>
-          <w:szCs w:val="22"/>
-          <w:rtl w:val="0"/>
-        </w:rPr>
-        <w:t xml:space="preserve"> The use of AI tools (such as ChatGPT, Claude, GitHub Copilot, etc.) is permitted in this course, with the following requirements:</w:t>
+        <w:t>Course AI policy video: AI Policy for Professor Bear's Courses | Using AI Responsibly in Class — https://youtu.be/8Ut0Cdl6vMw?si=9w3aEpt1ZyAR4Kiz</w:t>
       </w:r>
     </w:p>
     <w:p>
@@ -7032,7 +6543,7 @@
           <w:szCs w:val="22"/>
           <w:rtl w:val="0"/>
         </w:rPr>
-        <w:t xml:space="preserve">All AI usage must be properly cited:</w:t>
+        <w:t>AI assistance is allowed and expected. This course uses Claude and Python, with Claude Code access assumed.</w:t>
       </w:r>
     </w:p>
     <w:p>
@@ -7056,7 +6567,7 @@
           <w:szCs w:val="22"/>
           <w:rtl w:val="0"/>
         </w:rPr>
-        <w:t xml:space="preserve">Include the name of the AI tool used</w:t>
+        <w:t>Use AI to learn, inspect, test, and refine—not to substitute a finished answer for your understanding.</w:t>
       </w:r>
     </w:p>
     <w:p>
@@ -7080,7 +6591,7 @@
           <w:szCs w:val="22"/>
           <w:rtl w:val="0"/>
         </w:rPr>
-        <w:t xml:space="preserve">Specify which portions of your work were AI-assisted</w:t>
+        <w:t>AI use alone is not cheating, and it does not establish correctness, understanding, or a high grade.</w:t>
       </w:r>
     </w:p>
     <w:p>
@@ -7104,7 +6615,7 @@
           <w:szCs w:val="22"/>
           <w:rtl w:val="0"/>
         </w:rPr>
-        <w:t xml:space="preserve">Describe how the AI was used (e.g., generating code, editing text, brainstorming ideas)</w:t>
+        <w:t>Citation and contribution</w:t>
       </w:r>
     </w:p>
     <w:p>
@@ -7127,7 +6638,7 @@
           <w:szCs w:val="22"/>
           <w:rtl w:val="0"/>
         </w:rPr>
-        <w:t xml:space="preserve">Demonstration of Understanding</w:t>
+        <w:t>Name the AI tool and identify the parts of the work it assisted.</w:t>
       </w:r>
     </w:p>
     <w:p>
@@ -7151,7 +6662,7 @@
           <w:szCs w:val="22"/>
           <w:rtl w:val="0"/>
         </w:rPr>
-        <w:t xml:space="preserve">Students must be able to explain any AI-generated content in their submissions</w:t>
+        <w:t>State what Claude contributed and what you personally attempted, checked, revised, accepted, rejected, and decided.</w:t>
       </w:r>
     </w:p>
     <w:p>
@@ -7175,7 +6686,7 @@
           <w:szCs w:val="22"/>
           <w:rtl w:val="0"/>
         </w:rPr>
-        <w:t xml:space="preserve">Teaching Assistants or the Professor may ask students to walk through and explain any part of their work</w:t>
+        <w:t>Credit starter assignments, repositories, examples, collaborators, and sources.</w:t>
       </w:r>
     </w:p>
     <w:p>
@@ -7199,7 +6710,7 @@
           <w:szCs w:val="22"/>
           <w:rtl w:val="0"/>
         </w:rPr>
-        <w:t xml:space="preserve">Inability to demonstrate understanding of submitted work may result in grade penalties</w:t>
+        <w:t>Do not submit an unchanged prior artifact as your own contribution.</w:t>
       </w:r>
     </w:p>
     <w:p>
@@ -7222,7 +6733,7 @@
           <w:szCs w:val="22"/>
           <w:rtl w:val="0"/>
         </w:rPr>
-        <w:t xml:space="preserve">Academic Integrity</w:t>
+        <w:t>Demonstration of understanding</w:t>
       </w:r>
     </w:p>
     <w:p>
@@ -7246,7 +6757,7 @@
           <w:szCs w:val="22"/>
           <w:rtl w:val="0"/>
         </w:rPr>
-        <w:t xml:space="preserve">Students are responsible for all submitted work, regardless of how it was generated</w:t>
+        <w:t>You remain responsible for all submitted work, regardless of how it was produced.</w:t>
       </w:r>
     </w:p>
     <w:p>
@@ -7270,7 +6781,7 @@
           <w:szCs w:val="22"/>
           <w:rtl w:val="0"/>
         </w:rPr>
-        <w:t xml:space="preserve">AI should be used as a tool to enhance learning, not to bypass it</w:t>
+        <w:t>The instructor or a TA may ask you to explain code, writing, equations, methods, evidence, or results.</w:t>
       </w:r>
     </w:p>
     <w:p>
@@ -7294,7 +6805,7 @@
           <w:szCs w:val="22"/>
           <w:rtl w:val="0"/>
         </w:rPr>
-        <w:t xml:space="preserve">Using AI without citation constitutes academic dishonesty</w:t>
+        <w:t>Inability to explain submitted work may reduce points under the relevant rubric criteria.</w:t>
       </w:r>
     </w:p>
     <w:p>
@@ -7317,7 +6828,7 @@
           <w:szCs w:val="22"/>
           <w:rtl w:val="0"/>
         </w:rPr>
-        <w:t xml:space="preserve">Quality Expectations and Grading</w:t>
+        <w:t>Evidence and verification</w:t>
       </w:r>
     </w:p>
     <w:p>
@@ -7336,7 +6847,7 @@
           <w:szCs w:val="22"/>
           <w:rtl w:val="0"/>
         </w:rPr>
-        <w:t xml:space="preserve">Due to the widespread availability of AI tools, a relative grading component (20% of total points) will be applied to all assignments worth 100 points or more. This component evaluates your work compared to peers, with emphasis on:</w:t>
+        <w:t>Distinguish actual runs from proposals, simulations, fixtures, and unverified claims.</w:t>
       </w:r>
     </w:p>
     <w:p>
@@ -7360,7 +6871,7 @@
           <w:szCs w:val="22"/>
           <w:rtl w:val="0"/>
         </w:rPr>
-        <w:t xml:space="preserve">Originality and creativity beyond AI-generated content</w:t>
+        <w:t>Report limitations, failures, and unresolved questions plainly.</w:t>
       </w:r>
     </w:p>
     <w:p>
@@ -7384,7 +6895,7 @@
           <w:szCs w:val="22"/>
           <w:rtl w:val="0"/>
         </w:rPr>
-        <w:t xml:space="preserve">Depth of understanding demonstrated</w:t>
+        <w:t>A fluent explanation or polished artifact does not make an unsupported result valid.</w:t>
       </w:r>
     </w:p>
     <w:p>
@@ -7408,7 +6919,7 @@
           <w:szCs w:val="22"/>
           <w:rtl w:val="0"/>
         </w:rPr>
-        <w:t xml:space="preserve">Customization and personalization of solutions</w:t>
+        <w:t>Do not submit secrets, restricted data, or content you lack authority to share.</w:t>
       </w:r>
     </w:p>
     <w:p>
@@ -7432,7 +6943,7 @@
           <w:szCs w:val="22"/>
           <w:rtl w:val="0"/>
         </w:rPr>
-        <w:t xml:space="preserve">Real-world applicability</w:t>
+        <w:t>Frictional</w:t>
       </w:r>
     </w:p>
     <w:p>
@@ -7455,7 +6966,7 @@
           <w:szCs w:val="22"/>
           <w:rtl w:val="0"/>
         </w:rPr>
-        <w:t xml:space="preserve">Quality Score Breakdown (20 points)</w:t>
+        <w:t>Keep dated entries in FRICTIONAL.md as you work. Record actual attempts, expectations, unexpected results, difficult decisions, assistance, learning, uncertainty, and relevant evidence.</w:t>
       </w:r>
     </w:p>
     <w:p>
@@ -7476,16 +6987,7 @@
           <w:szCs w:val="22"/>
           <w:rtl w:val="0"/>
         </w:rPr>
-        <w:t xml:space="preserve">Bottom 25% (5 points):</w:t>
-      </w:r>
-      <w:r>
-        <w:rPr>
-          <w:rFonts w:ascii="Calibri" w:cs="Calibri" w:eastAsia="Calibri" w:hAnsi="Calibri"/>
-          <w:sz w:val="22"/>
-          <w:szCs w:val="22"/>
-          <w:rtl w:val="0"/>
-        </w:rPr>
-        <w:t xml:space="preserve"> Meets basic requirements but lacks depth or real-world relevance. Basic implementation with minimal customization. Limited error handling and interaction. Superficial documentation and demonstration.</w:t>
+        <w:t>Frictional is an honest log of effort, not a timesheet or a performance of suffering. An unsuccessful attempt can receive full credit when it is specific and truthful.</w:t>
       </w:r>
     </w:p>
     <w:p>
@@ -7506,16 +7008,7 @@
           <w:szCs w:val="22"/>
           <w:rtl w:val="0"/>
         </w:rPr>
-        <w:t xml:space="preserve">26th–50th percentile (10 points):</w:t>
-      </w:r>
-      <w:r>
-        <w:rPr>
-          <w:rFonts w:ascii="Calibri" w:cs="Calibri" w:eastAsia="Calibri" w:hAnsi="Calibri"/>
-          <w:sz w:val="22"/>
-          <w:szCs w:val="22"/>
-          <w:rtl w:val="0"/>
-        </w:rPr>
-        <w:t xml:space="preserve"> Solid implementation with thoughtful design. Functional tools with appropriate integration. Basic error handling and memory implementation. Clear documentation and demonstration.</w:t>
+        <w:t>AI may organize notes that you actually supplied; it must not invent your struggle, timestamps, or understanding.</w:t>
       </w:r>
     </w:p>
     <w:p>
@@ -7536,16 +7029,7 @@
           <w:szCs w:val="22"/>
           <w:rtl w:val="0"/>
         </w:rPr>
-        <w:t xml:space="preserve">51st–75th percentile (15 points):</w:t>
-      </w:r>
-      <w:r>
-        <w:rPr>
-          <w:rFonts w:ascii="Calibri" w:cs="Calibri" w:eastAsia="Calibri" w:hAnsi="Calibri"/>
-          <w:sz w:val="22"/>
-          <w:szCs w:val="22"/>
-          <w:rtl w:val="0"/>
-        </w:rPr>
-        <w:t xml:space="preserve"> Strong technical implementation with clear real-world applications. Sophisticated interactions and tool integration. Comprehensive error handling and management. Professional documentation and compelling demonstration. Evidence of testing and performance optimization.</w:t>
+        <w:t>Connect entries to relevant commits, prompt excerpts, outputs, drafts, or tests when useful. Complete private chat transcripts are unnecessary.</w:t>
       </w:r>
     </w:p>
     <w:p>
@@ -7566,16 +7050,7 @@
           <w:szCs w:val="22"/>
           <w:rtl w:val="0"/>
         </w:rPr>
-        <w:t xml:space="preserve">Top 25% (20 points):</w:t>
-      </w:r>
-      <w:r>
-        <w:rPr>
-          <w:rFonts w:ascii="Calibri" w:cs="Calibri" w:eastAsia="Calibri" w:hAnsi="Calibri"/>
-          <w:sz w:val="22"/>
-          <w:szCs w:val="22"/>
-          <w:rtl w:val="0"/>
-        </w:rPr>
-        <w:t xml:space="preserve"> Exceptional project demonstrating innovation and technical excellence. Novel application with demonstrable value. Advanced orchestration with sophisticated decision-making. Unique custom features that significantly enhance capabilities. Production-ready implementation with attention to scalability. Outstanding documentation and presentation.</w:t>
+        <w:t>Relative quality</w:t>
       </w:r>
     </w:p>
     <w:p>
@@ -7598,7 +7073,7 @@
           <w:szCs w:val="22"/>
           <w:rtl w:val="0"/>
         </w:rPr>
-        <w:t xml:space="preserve">Best Practices for AI Use</w:t>
+        <w:t>Because every student may use AI, a quick first draft may compare poorly with classmates' tested, refined, and clearly explained work.</w:t>
       </w:r>
     </w:p>
     <w:p>
@@ -7617,7 +7092,7 @@
           <w:szCs w:val="22"/>
           <w:rtl w:val="0"/>
         </w:rPr>
-        <w:t xml:space="preserve">Use AI as a learning tool:</w:t>
+        <w:t>Reviewers compare demonstrated quality, not presumed effort, paid-tool access, commit count, or production style.</w:t>
       </w:r>
     </w:p>
     <w:p>
@@ -7641,7 +7116,7 @@
           <w:szCs w:val="22"/>
           <w:rtl w:val="0"/>
         </w:rPr>
-        <w:t xml:space="preserve">Ask for explanations of concepts you don't understand</w:t>
+        <w:t>Professional communication supports substance; it cannot replace evidence or understanding.</w:t>
       </w:r>
     </w:p>
     <w:p>
@@ -7665,7 +7140,7 @@
           <w:szCs w:val="22"/>
           <w:rtl w:val="0"/>
         </w:rPr>
-        <w:t xml:space="preserve">Request alternative approaches to problems</w:t>
+        <w:t>Human and AI responsibilities</w:t>
       </w:r>
     </w:p>
     <w:p>
@@ -7689,7 +7164,7 @@
           <w:szCs w:val="22"/>
           <w:rtl w:val="0"/>
         </w:rPr>
-        <w:t xml:space="preserve">Use AI to review your work and suggest improvements</w:t>
+        <w:t>AI may perform bounded computation, drafting, retrieval, transformation, and critique within the approved action surface.</w:t>
       </w:r>
     </w:p>
     <w:p>
@@ -7708,7 +7183,7 @@
           <w:szCs w:val="22"/>
           <w:rtl w:val="0"/>
         </w:rPr>
-        <w:t xml:space="preserve">Maintain your voice and perspective:</w:t>
+        <w:t>The human establishes purpose, authority, data boundaries, responsibility, consent, judgment, and final approval.</w:t>
       </w:r>
     </w:p>
     <w:p>
@@ -7732,7 +7207,7 @@
           <w:szCs w:val="22"/>
           <w:rtl w:val="0"/>
         </w:rPr>
-        <w:t xml:space="preserve">Edit and refine AI-generated content to reflect your understanding</w:t>
+        <w:t>Students must review proposed actions before consequential execution and verify outcomes afterward.</w:t>
       </w:r>
     </w:p>
     <w:p>
@@ -7756,7 +7231,7 @@
           <w:szCs w:val="22"/>
           <w:rtl w:val="0"/>
         </w:rPr>
-        <w:t xml:space="preserve">Add your own insights and observations</w:t>
+        <w:t>Academic integrity</w:t>
       </w:r>
     </w:p>
     <w:p>
@@ -7780,7 +7255,7 @@
           <w:szCs w:val="22"/>
           <w:rtl w:val="0"/>
         </w:rPr>
-        <w:t xml:space="preserve">Ensure the final work represents your learning and knowledge</w:t>
+        <w:t>Using AI without the required citation or misrepresenting contributions, runs, evidence, or understanding violates course and university policy.</w:t>
       </w:r>
     </w:p>
     <w:p>
@@ -7799,7 +7274,7 @@
           <w:szCs w:val="22"/>
           <w:rtl w:val="0"/>
         </w:rPr>
-        <w:t xml:space="preserve">Document your process:</w:t>
+        <w:t>You must be able to defend the version submitted under your name.</w:t>
       </w:r>
     </w:p>
     <w:p>
@@ -7823,7 +7298,7 @@
           <w:szCs w:val="22"/>
           <w:rtl w:val="0"/>
         </w:rPr>
-        <w:t xml:space="preserve">Keep a record of your prompts and the AI's responses</w:t>
+        <w:t>Use the repository's prerequisite AI policy, Frictional rubric, GitHub posting rubric, and Relative Quartile rubric for complete requirements.</w:t>
       </w:r>
     </w:p>
     <w:p>
@@ -7847,7 +7322,7 @@
           <w:szCs w:val="22"/>
           <w:rtl w:val="0"/>
         </w:rPr>
-        <w:t xml:space="preserve">Note any modifications you made to AI-generated content</w:t>
+        <w:t>Ask the instructor before proceeding when authority, collaboration, source use, or disclosure requirements are unclear.</w:t>
       </w:r>
     </w:p>
     <w:p>
@@ -7871,7 +7346,7 @@
           <w:szCs w:val="22"/>
           <w:rtl w:val="0"/>
         </w:rPr>
-        <w:t xml:space="preserve">Be prepared to discuss your collaboration with AI during evaluation</w:t>
+        <w:t>The course AI policy supplements, and does not replace, Northeastern's Academic Integrity policy.</w:t>
       </w:r>
     </w:p>
     <w:p>
@@ -7890,7 +7365,7 @@
           <w:szCs w:val="22"/>
           <w:rtl w:val="0"/>
         </w:rPr>
-        <w:t xml:space="preserve">By following this policy, you can ethically leverage AI tools while ensuring they enhance rather than replace your learning experience in this course.</w:t>
+        <w:t>The student remains accountable for the final submission and its consequences.</w:t>
       </w:r>
     </w:p>
     <w:p>

</xml_diff>